<commit_message>
Aufgabe 8-10: Black- und Whiteboxtest, Fehler behoben
</commit_message>
<xml_diff>
--- a/Andere Aufgaben/Aufgabe 8/Blackboxtest_Projektwoche2026.docx
+++ b/Andere Aufgaben/Aufgabe 8/Blackboxtest_Projektwoche2026.docx
@@ -26,14 +26,14 @@
           <w:sz w:val="18"/>
           <w:szCs w:val="18"/>
         </w:rPr>
-        <w:t>Nasser Ahmadi</w:t>
+        <w:t xml:space="preserve">Name: </w:t>
       </w:r>
       <w:r>
         <w:rPr>
           <w:sz w:val="18"/>
           <w:szCs w:val="18"/>
         </w:rPr>
-        <w:t xml:space="preserve">  </w:t>
+        <w:t xml:space="preserve">Nasser Ahmadi   </w:t>
       </w:r>
       <w:r>
         <w:rPr>
@@ -49,21 +49,7 @@
           <w:sz w:val="18"/>
           <w:szCs w:val="18"/>
         </w:rPr>
-        <w:t>09.0</w:t>
-      </w:r>
-      <w:r>
-        <w:rPr>
-          <w:sz w:val="18"/>
-          <w:szCs w:val="18"/>
-        </w:rPr>
-        <w:t>4</w:t>
-      </w:r>
-      <w:r>
-        <w:rPr>
-          <w:sz w:val="18"/>
-          <w:szCs w:val="18"/>
-        </w:rPr>
-        <w:t xml:space="preserve">.2026  </w:t>
+        <w:t xml:space="preserve">09.04.2026   </w:t>
       </w:r>
       <w:r>
         <w:rPr>
@@ -76,17 +62,36 @@
       </w:r>
       <w:r>
         <w:rPr>
+          <w:sz w:val="18"/>
+          <w:szCs w:val="18"/>
+        </w:rPr>
+        <w:t xml:space="preserve">AIF31   </w:t>
+      </w:r>
+    </w:p>
+    <w:p>
+      <w:pPr>
+        <w:spacing w:after="100"/>
+      </w:pPr>
+      <w:r>
+        <w:rPr>
           <w:b/>
           <w:bCs/>
           <w:sz w:val="18"/>
           <w:szCs w:val="18"/>
         </w:rPr>
-        <w:t>AIF31</w:t>
+        <w:t xml:space="preserve">Anmerkung: </w:t>
+      </w:r>
+      <w:r>
+        <w:rPr>
+          <w:sz w:val="18"/>
+          <w:szCs w:val="18"/>
+        </w:rPr>
+        <w:t>Da zuhause kein Schulserver (MySQL) verfügbar ist, wurden die meisten Tests per Code-Analyse durchgeführt</w:t>
       </w:r>
     </w:p>
     <w:tbl>
       <w:tblPr>
-        <w:tblW w:w="15503" w:type="dxa"/>
+        <w:tblW w:w="15494" w:type="dxa"/>
         <w:tblBorders>
           <w:top w:val="single" w:sz="4" w:space="0" w:color="auto"/>
           <w:left w:val="single" w:sz="4" w:space="0" w:color="auto"/>
@@ -99,15 +104,15 @@
           <w:left w:w="10" w:type="dxa"/>
           <w:right w:w="10" w:type="dxa"/>
         </w:tblCellMar>
-        <w:tblLook w:val="04A0" w:firstRow="1" w:lastRow="0" w:firstColumn="1" w:lastColumn="0" w:noHBand="0" w:noVBand="1"/>
+        <w:tblLook w:val="0000" w:firstRow="0" w:lastRow="0" w:firstColumn="0" w:lastColumn="0" w:noHBand="0" w:noVBand="0"/>
       </w:tblPr>
       <w:tblGrid>
-        <w:gridCol w:w="768"/>
-        <w:gridCol w:w="2883"/>
-        <w:gridCol w:w="2402"/>
-        <w:gridCol w:w="3844"/>
-        <w:gridCol w:w="4485"/>
-        <w:gridCol w:w="1121"/>
+        <w:gridCol w:w="942"/>
+        <w:gridCol w:w="3008"/>
+        <w:gridCol w:w="2739"/>
+        <w:gridCol w:w="3323"/>
+        <w:gridCol w:w="4108"/>
+        <w:gridCol w:w="1374"/>
       </w:tblGrid>
       <w:tr>
         <w:tblPrEx>
@@ -117,12 +122,12 @@
           </w:tblCellMar>
         </w:tblPrEx>
         <w:trPr>
-          <w:trHeight w:val="362"/>
+          <w:trHeight w:val="389"/>
           <w:tblHeader/>
         </w:trPr>
         <w:tc>
           <w:tcPr>
-            <w:tcW w:w="768" w:type="dxa"/>
+            <w:tcW w:w="942" w:type="dxa"/>
             <w:tcBorders>
               <w:top w:val="single" w:sz="1" w:space="0" w:color="000000"/>
               <w:left w:val="single" w:sz="1" w:space="0" w:color="000000"/>
@@ -152,7 +157,7 @@
         </w:tc>
         <w:tc>
           <w:tcPr>
-            <w:tcW w:w="2883" w:type="dxa"/>
+            <w:tcW w:w="3008" w:type="dxa"/>
             <w:tcBorders>
               <w:top w:val="single" w:sz="1" w:space="0" w:color="000000"/>
               <w:left w:val="single" w:sz="1" w:space="0" w:color="000000"/>
@@ -182,7 +187,7 @@
         </w:tc>
         <w:tc>
           <w:tcPr>
-            <w:tcW w:w="2402" w:type="dxa"/>
+            <w:tcW w:w="2739" w:type="dxa"/>
             <w:tcBorders>
               <w:top w:val="single" w:sz="1" w:space="0" w:color="000000"/>
               <w:left w:val="single" w:sz="1" w:space="0" w:color="000000"/>
@@ -212,7 +217,7 @@
         </w:tc>
         <w:tc>
           <w:tcPr>
-            <w:tcW w:w="3844" w:type="dxa"/>
+            <w:tcW w:w="3323" w:type="dxa"/>
             <w:tcBorders>
               <w:top w:val="single" w:sz="1" w:space="0" w:color="000000"/>
               <w:left w:val="single" w:sz="1" w:space="0" w:color="000000"/>
@@ -242,7 +247,7 @@
         </w:tc>
         <w:tc>
           <w:tcPr>
-            <w:tcW w:w="4485" w:type="dxa"/>
+            <w:tcW w:w="4108" w:type="dxa"/>
             <w:tcBorders>
               <w:top w:val="single" w:sz="1" w:space="0" w:color="000000"/>
               <w:left w:val="single" w:sz="1" w:space="0" w:color="000000"/>
@@ -272,7 +277,7 @@
         </w:tc>
         <w:tc>
           <w:tcPr>
-            <w:tcW w:w="1121" w:type="dxa"/>
+            <w:tcW w:w="1374" w:type="dxa"/>
             <w:tcBorders>
               <w:top w:val="single" w:sz="1" w:space="0" w:color="000000"/>
               <w:left w:val="single" w:sz="1" w:space="0" w:color="000000"/>
@@ -309,11 +314,11 @@
           </w:tblCellMar>
         </w:tblPrEx>
         <w:trPr>
-          <w:trHeight w:val="723"/>
+          <w:trHeight w:val="694"/>
         </w:trPr>
         <w:tc>
           <w:tcPr>
-            <w:tcW w:w="768" w:type="dxa"/>
+            <w:tcW w:w="942" w:type="dxa"/>
             <w:tcBorders>
               <w:top w:val="single" w:sz="1" w:space="0" w:color="000000"/>
               <w:left w:val="single" w:sz="1" w:space="0" w:color="000000"/>
@@ -340,34 +345,34 @@
         </w:tc>
         <w:tc>
           <w:tcPr>
-            <w:tcW w:w="2883" w:type="dxa"/>
-            <w:tcBorders>
-              <w:top w:val="single" w:sz="1" w:space="0" w:color="000000"/>
-              <w:left w:val="single" w:sz="1" w:space="0" w:color="000000"/>
-              <w:bottom w:val="single" w:sz="1" w:space="0" w:color="000000"/>
-              <w:right w:val="single" w:sz="1" w:space="0" w:color="000000"/>
-            </w:tcBorders>
-            <w:shd w:val="clear" w:color="auto" w:fill="FFFFFF"/>
-            <w:tcMar>
-              <w:top w:w="40" w:type="dxa"/>
-              <w:left w:w="80" w:type="dxa"/>
-              <w:bottom w:w="40" w:type="dxa"/>
-              <w:right w:w="80" w:type="dxa"/>
-            </w:tcMar>
-          </w:tcPr>
-          <w:p>
-            <w:r>
-              <w:rPr>
-                <w:sz w:val="14"/>
-                <w:szCs w:val="14"/>
-              </w:rPr>
-              <w:t>Workshops anzeigen – DB enthält Einträge</w:t>
-            </w:r>
-          </w:p>
-        </w:tc>
-        <w:tc>
-          <w:tcPr>
-            <w:tcW w:w="2402" w:type="dxa"/>
+            <w:tcW w:w="3008" w:type="dxa"/>
+            <w:tcBorders>
+              <w:top w:val="single" w:sz="1" w:space="0" w:color="000000"/>
+              <w:left w:val="single" w:sz="1" w:space="0" w:color="000000"/>
+              <w:bottom w:val="single" w:sz="1" w:space="0" w:color="000000"/>
+              <w:right w:val="single" w:sz="1" w:space="0" w:color="000000"/>
+            </w:tcBorders>
+            <w:shd w:val="clear" w:color="auto" w:fill="FFFFFF"/>
+            <w:tcMar>
+              <w:top w:w="40" w:type="dxa"/>
+              <w:left w:w="80" w:type="dxa"/>
+              <w:bottom w:w="40" w:type="dxa"/>
+              <w:right w:w="80" w:type="dxa"/>
+            </w:tcMar>
+          </w:tcPr>
+          <w:p>
+            <w:r>
+              <w:rPr>
+                <w:sz w:val="14"/>
+                <w:szCs w:val="14"/>
+              </w:rPr>
+              <w:t>Workshops anzeigen – DB hat Einträge</w:t>
+            </w:r>
+          </w:p>
+        </w:tc>
+        <w:tc>
+          <w:tcPr>
+            <w:tcW w:w="2739" w:type="dxa"/>
             <w:tcBorders>
               <w:top w:val="single" w:sz="1" w:space="0" w:color="000000"/>
               <w:left w:val="single" w:sz="1" w:space="0" w:color="000000"/>
@@ -394,68 +399,84 @@
         </w:tc>
         <w:tc>
           <w:tcPr>
-            <w:tcW w:w="3844" w:type="dxa"/>
-            <w:tcBorders>
-              <w:top w:val="single" w:sz="1" w:space="0" w:color="000000"/>
-              <w:left w:val="single" w:sz="1" w:space="0" w:color="000000"/>
-              <w:bottom w:val="single" w:sz="1" w:space="0" w:color="000000"/>
-              <w:right w:val="single" w:sz="1" w:space="0" w:color="000000"/>
-            </w:tcBorders>
-            <w:shd w:val="clear" w:color="auto" w:fill="FFFFFF"/>
-            <w:tcMar>
-              <w:top w:w="40" w:type="dxa"/>
-              <w:left w:w="80" w:type="dxa"/>
-              <w:bottom w:w="40" w:type="dxa"/>
-              <w:right w:w="80" w:type="dxa"/>
-            </w:tcMar>
-          </w:tcPr>
-          <w:p>
-            <w:r>
-              <w:rPr>
-                <w:sz w:val="14"/>
-                <w:szCs w:val="14"/>
-              </w:rPr>
-              <w:t>Alle Titel erscheinen zeilenweise in der TextBox</w:t>
-            </w:r>
-          </w:p>
-        </w:tc>
-        <w:tc>
-          <w:tcPr>
-            <w:tcW w:w="4485" w:type="dxa"/>
-            <w:tcBorders>
-              <w:top w:val="single" w:sz="1" w:space="0" w:color="000000"/>
-              <w:left w:val="single" w:sz="1" w:space="0" w:color="000000"/>
-              <w:bottom w:val="single" w:sz="1" w:space="0" w:color="000000"/>
-              <w:right w:val="single" w:sz="1" w:space="0" w:color="000000"/>
-            </w:tcBorders>
-            <w:shd w:val="clear" w:color="auto" w:fill="FFFFFF"/>
-            <w:tcMar>
-              <w:top w:w="40" w:type="dxa"/>
-              <w:left w:w="80" w:type="dxa"/>
-              <w:bottom w:w="40" w:type="dxa"/>
-              <w:right w:w="80" w:type="dxa"/>
-            </w:tcMar>
-          </w:tcPr>
-          <w:p/>
-        </w:tc>
-        <w:tc>
-          <w:tcPr>
-            <w:tcW w:w="1121" w:type="dxa"/>
-            <w:tcBorders>
-              <w:top w:val="single" w:sz="1" w:space="0" w:color="000000"/>
-              <w:left w:val="single" w:sz="1" w:space="0" w:color="000000"/>
-              <w:bottom w:val="single" w:sz="1" w:space="0" w:color="000000"/>
-              <w:right w:val="single" w:sz="1" w:space="0" w:color="000000"/>
-            </w:tcBorders>
-            <w:shd w:val="clear" w:color="auto" w:fill="FFFFFF"/>
-            <w:tcMar>
-              <w:top w:w="40" w:type="dxa"/>
-              <w:left w:w="80" w:type="dxa"/>
-              <w:bottom w:w="40" w:type="dxa"/>
-              <w:right w:w="80" w:type="dxa"/>
-            </w:tcMar>
-          </w:tcPr>
-          <w:p/>
+            <w:tcW w:w="3323" w:type="dxa"/>
+            <w:tcBorders>
+              <w:top w:val="single" w:sz="1" w:space="0" w:color="000000"/>
+              <w:left w:val="single" w:sz="1" w:space="0" w:color="000000"/>
+              <w:bottom w:val="single" w:sz="1" w:space="0" w:color="000000"/>
+              <w:right w:val="single" w:sz="1" w:space="0" w:color="000000"/>
+            </w:tcBorders>
+            <w:shd w:val="clear" w:color="auto" w:fill="FFFFFF"/>
+            <w:tcMar>
+              <w:top w:w="40" w:type="dxa"/>
+              <w:left w:w="80" w:type="dxa"/>
+              <w:bottom w:w="40" w:type="dxa"/>
+              <w:right w:w="80" w:type="dxa"/>
+            </w:tcMar>
+          </w:tcPr>
+          <w:p>
+            <w:r>
+              <w:rPr>
+                <w:sz w:val="14"/>
+                <w:szCs w:val="14"/>
+              </w:rPr>
+              <w:t>Alle Titel erscheinen in der TextBox untereinander</w:t>
+            </w:r>
+          </w:p>
+        </w:tc>
+        <w:tc>
+          <w:tcPr>
+            <w:tcW w:w="4108" w:type="dxa"/>
+            <w:tcBorders>
+              <w:top w:val="single" w:sz="1" w:space="0" w:color="000000"/>
+              <w:left w:val="single" w:sz="1" w:space="0" w:color="000000"/>
+              <w:bottom w:val="single" w:sz="1" w:space="0" w:color="000000"/>
+              <w:right w:val="single" w:sz="1" w:space="0" w:color="000000"/>
+            </w:tcBorders>
+            <w:shd w:val="clear" w:color="auto" w:fill="FFFFFF"/>
+            <w:tcMar>
+              <w:top w:w="40" w:type="dxa"/>
+              <w:left w:w="80" w:type="dxa"/>
+              <w:bottom w:w="40" w:type="dxa"/>
+              <w:right w:w="80" w:type="dxa"/>
+            </w:tcMar>
+          </w:tcPr>
+          <w:p>
+            <w:r>
+              <w:rPr>
+                <w:sz w:val="14"/>
+                <w:szCs w:val="14"/>
+              </w:rPr>
+              <w:t>Test nicht durchführbar (kein Schulserver zuhause) – im Code wird die Liste korrekt durchlaufen und ausgegeben</w:t>
+            </w:r>
+          </w:p>
+        </w:tc>
+        <w:tc>
+          <w:tcPr>
+            <w:tcW w:w="1374" w:type="dxa"/>
+            <w:tcBorders>
+              <w:top w:val="single" w:sz="1" w:space="0" w:color="000000"/>
+              <w:left w:val="single" w:sz="1" w:space="0" w:color="000000"/>
+              <w:bottom w:val="single" w:sz="1" w:space="0" w:color="000000"/>
+              <w:right w:val="single" w:sz="1" w:space="0" w:color="000000"/>
+            </w:tcBorders>
+            <w:shd w:val="clear" w:color="auto" w:fill="FFFFFF"/>
+            <w:tcMar>
+              <w:top w:w="40" w:type="dxa"/>
+              <w:left w:w="80" w:type="dxa"/>
+              <w:bottom w:w="40" w:type="dxa"/>
+              <w:right w:w="80" w:type="dxa"/>
+            </w:tcMar>
+          </w:tcPr>
+          <w:p>
+            <w:r>
+              <w:rPr>
+                <w:sz w:val="14"/>
+                <w:szCs w:val="14"/>
+              </w:rPr>
+              <w:t>OK</w:t>
+            </w:r>
+          </w:p>
         </w:tc>
       </w:tr>
       <w:tr>
@@ -466,11 +487,11 @@
           </w:tblCellMar>
         </w:tblPrEx>
         <w:trPr>
-          <w:trHeight w:val="672"/>
+          <w:trHeight w:val="513"/>
         </w:trPr>
         <w:tc>
           <w:tcPr>
-            <w:tcW w:w="768" w:type="dxa"/>
+            <w:tcW w:w="942" w:type="dxa"/>
             <w:tcBorders>
               <w:top w:val="single" w:sz="1" w:space="0" w:color="000000"/>
               <w:left w:val="single" w:sz="1" w:space="0" w:color="000000"/>
@@ -497,7 +518,7 @@
         </w:tc>
         <w:tc>
           <w:tcPr>
-            <w:tcW w:w="2883" w:type="dxa"/>
+            <w:tcW w:w="3008" w:type="dxa"/>
             <w:tcBorders>
               <w:top w:val="single" w:sz="1" w:space="0" w:color="000000"/>
               <w:left w:val="single" w:sz="1" w:space="0" w:color="000000"/>
@@ -524,95 +545,111 @@
         </w:tc>
         <w:tc>
           <w:tcPr>
-            <w:tcW w:w="2402" w:type="dxa"/>
-            <w:tcBorders>
-              <w:top w:val="single" w:sz="1" w:space="0" w:color="000000"/>
-              <w:left w:val="single" w:sz="1" w:space="0" w:color="000000"/>
-              <w:bottom w:val="single" w:sz="1" w:space="0" w:color="000000"/>
-              <w:right w:val="single" w:sz="1" w:space="0" w:color="000000"/>
-            </w:tcBorders>
-            <w:shd w:val="clear" w:color="auto" w:fill="FFFFFF"/>
-            <w:tcMar>
-              <w:top w:w="40" w:type="dxa"/>
-              <w:left w:w="80" w:type="dxa"/>
-              <w:bottom w:w="40" w:type="dxa"/>
-              <w:right w:w="80" w:type="dxa"/>
-            </w:tcMar>
-          </w:tcPr>
-          <w:p>
-            <w:r>
-              <w:rPr>
-                <w:sz w:val="14"/>
-                <w:szCs w:val="14"/>
-              </w:rPr>
-              <w:t>Klick auf "Anzeigen" (leere DB)</w:t>
-            </w:r>
-          </w:p>
-        </w:tc>
-        <w:tc>
-          <w:tcPr>
-            <w:tcW w:w="3844" w:type="dxa"/>
-            <w:tcBorders>
-              <w:top w:val="single" w:sz="1" w:space="0" w:color="000000"/>
-              <w:left w:val="single" w:sz="1" w:space="0" w:color="000000"/>
-              <w:bottom w:val="single" w:sz="1" w:space="0" w:color="000000"/>
-              <w:right w:val="single" w:sz="1" w:space="0" w:color="000000"/>
-            </w:tcBorders>
-            <w:shd w:val="clear" w:color="auto" w:fill="FFFFFF"/>
-            <w:tcMar>
-              <w:top w:w="40" w:type="dxa"/>
-              <w:left w:w="80" w:type="dxa"/>
-              <w:bottom w:w="40" w:type="dxa"/>
-              <w:right w:w="80" w:type="dxa"/>
-            </w:tcMar>
-          </w:tcPr>
-          <w:p>
-            <w:r>
-              <w:rPr>
-                <w:sz w:val="14"/>
-                <w:szCs w:val="14"/>
-              </w:rPr>
-              <w:t>TextBox bleibt leer, kein Absturz</w:t>
-            </w:r>
-          </w:p>
-        </w:tc>
-        <w:tc>
-          <w:tcPr>
-            <w:tcW w:w="4485" w:type="dxa"/>
-            <w:tcBorders>
-              <w:top w:val="single" w:sz="1" w:space="0" w:color="000000"/>
-              <w:left w:val="single" w:sz="1" w:space="0" w:color="000000"/>
-              <w:bottom w:val="single" w:sz="1" w:space="0" w:color="000000"/>
-              <w:right w:val="single" w:sz="1" w:space="0" w:color="000000"/>
-            </w:tcBorders>
-            <w:shd w:val="clear" w:color="auto" w:fill="FFFFFF"/>
-            <w:tcMar>
-              <w:top w:w="40" w:type="dxa"/>
-              <w:left w:w="80" w:type="dxa"/>
-              <w:bottom w:w="40" w:type="dxa"/>
-              <w:right w:w="80" w:type="dxa"/>
-            </w:tcMar>
-          </w:tcPr>
-          <w:p/>
-        </w:tc>
-        <w:tc>
-          <w:tcPr>
-            <w:tcW w:w="1121" w:type="dxa"/>
-            <w:tcBorders>
-              <w:top w:val="single" w:sz="1" w:space="0" w:color="000000"/>
-              <w:left w:val="single" w:sz="1" w:space="0" w:color="000000"/>
-              <w:bottom w:val="single" w:sz="1" w:space="0" w:color="000000"/>
-              <w:right w:val="single" w:sz="1" w:space="0" w:color="000000"/>
-            </w:tcBorders>
-            <w:shd w:val="clear" w:color="auto" w:fill="FFFFFF"/>
-            <w:tcMar>
-              <w:top w:w="40" w:type="dxa"/>
-              <w:left w:w="80" w:type="dxa"/>
-              <w:bottom w:w="40" w:type="dxa"/>
-              <w:right w:w="80" w:type="dxa"/>
-            </w:tcMar>
-          </w:tcPr>
-          <w:p/>
+            <w:tcW w:w="2739" w:type="dxa"/>
+            <w:tcBorders>
+              <w:top w:val="single" w:sz="1" w:space="0" w:color="000000"/>
+              <w:left w:val="single" w:sz="1" w:space="0" w:color="000000"/>
+              <w:bottom w:val="single" w:sz="1" w:space="0" w:color="000000"/>
+              <w:right w:val="single" w:sz="1" w:space="0" w:color="000000"/>
+            </w:tcBorders>
+            <w:shd w:val="clear" w:color="auto" w:fill="FFFFFF"/>
+            <w:tcMar>
+              <w:top w:w="40" w:type="dxa"/>
+              <w:left w:w="80" w:type="dxa"/>
+              <w:bottom w:w="40" w:type="dxa"/>
+              <w:right w:w="80" w:type="dxa"/>
+            </w:tcMar>
+          </w:tcPr>
+          <w:p>
+            <w:r>
+              <w:rPr>
+                <w:sz w:val="14"/>
+                <w:szCs w:val="14"/>
+              </w:rPr>
+              <w:t>Klick auf "Anzeigen"</w:t>
+            </w:r>
+          </w:p>
+        </w:tc>
+        <w:tc>
+          <w:tcPr>
+            <w:tcW w:w="3323" w:type="dxa"/>
+            <w:tcBorders>
+              <w:top w:val="single" w:sz="1" w:space="0" w:color="000000"/>
+              <w:left w:val="single" w:sz="1" w:space="0" w:color="000000"/>
+              <w:bottom w:val="single" w:sz="1" w:space="0" w:color="000000"/>
+              <w:right w:val="single" w:sz="1" w:space="0" w:color="000000"/>
+            </w:tcBorders>
+            <w:shd w:val="clear" w:color="auto" w:fill="FFFFFF"/>
+            <w:tcMar>
+              <w:top w:w="40" w:type="dxa"/>
+              <w:left w:w="80" w:type="dxa"/>
+              <w:bottom w:w="40" w:type="dxa"/>
+              <w:right w:w="80" w:type="dxa"/>
+            </w:tcMar>
+          </w:tcPr>
+          <w:p>
+            <w:r>
+              <w:rPr>
+                <w:sz w:val="14"/>
+                <w:szCs w:val="14"/>
+              </w:rPr>
+              <w:t>TextBox bleibt leer, keine Fehlermeldung</w:t>
+            </w:r>
+          </w:p>
+        </w:tc>
+        <w:tc>
+          <w:tcPr>
+            <w:tcW w:w="4108" w:type="dxa"/>
+            <w:tcBorders>
+              <w:top w:val="single" w:sz="1" w:space="0" w:color="000000"/>
+              <w:left w:val="single" w:sz="1" w:space="0" w:color="000000"/>
+              <w:bottom w:val="single" w:sz="1" w:space="0" w:color="000000"/>
+              <w:right w:val="single" w:sz="1" w:space="0" w:color="000000"/>
+            </w:tcBorders>
+            <w:shd w:val="clear" w:color="auto" w:fill="FFFFFF"/>
+            <w:tcMar>
+              <w:top w:w="40" w:type="dxa"/>
+              <w:left w:w="80" w:type="dxa"/>
+              <w:bottom w:w="40" w:type="dxa"/>
+              <w:right w:w="80" w:type="dxa"/>
+            </w:tcMar>
+          </w:tcPr>
+          <w:p>
+            <w:r>
+              <w:rPr>
+                <w:sz w:val="14"/>
+                <w:szCs w:val="14"/>
+              </w:rPr>
+              <w:t>Test nicht durchführbar – laut Code wird eine leere Liste zurückgegeben, kein Absturz</w:t>
+            </w:r>
+          </w:p>
+        </w:tc>
+        <w:tc>
+          <w:tcPr>
+            <w:tcW w:w="1374" w:type="dxa"/>
+            <w:tcBorders>
+              <w:top w:val="single" w:sz="1" w:space="0" w:color="000000"/>
+              <w:left w:val="single" w:sz="1" w:space="0" w:color="000000"/>
+              <w:bottom w:val="single" w:sz="1" w:space="0" w:color="000000"/>
+              <w:right w:val="single" w:sz="1" w:space="0" w:color="000000"/>
+            </w:tcBorders>
+            <w:shd w:val="clear" w:color="auto" w:fill="FFFFFF"/>
+            <w:tcMar>
+              <w:top w:w="40" w:type="dxa"/>
+              <w:left w:w="80" w:type="dxa"/>
+              <w:bottom w:w="40" w:type="dxa"/>
+              <w:right w:w="80" w:type="dxa"/>
+            </w:tcMar>
+          </w:tcPr>
+          <w:p>
+            <w:r>
+              <w:rPr>
+                <w:sz w:val="14"/>
+                <w:szCs w:val="14"/>
+              </w:rPr>
+              <w:t>OK</w:t>
+            </w:r>
+          </w:p>
         </w:tc>
       </w:tr>
       <w:tr>
@@ -623,11 +660,11 @@
           </w:tblCellMar>
         </w:tblPrEx>
         <w:trPr>
-          <w:trHeight w:val="723"/>
+          <w:trHeight w:val="513"/>
         </w:trPr>
         <w:tc>
           <w:tcPr>
-            <w:tcW w:w="768" w:type="dxa"/>
+            <w:tcW w:w="942" w:type="dxa"/>
             <w:tcBorders>
               <w:top w:val="single" w:sz="1" w:space="0" w:color="000000"/>
               <w:left w:val="single" w:sz="1" w:space="0" w:color="000000"/>
@@ -654,34 +691,34 @@
         </w:tc>
         <w:tc>
           <w:tcPr>
-            <w:tcW w:w="2883" w:type="dxa"/>
-            <w:tcBorders>
-              <w:top w:val="single" w:sz="1" w:space="0" w:color="000000"/>
-              <w:left w:val="single" w:sz="1" w:space="0" w:color="000000"/>
-              <w:bottom w:val="single" w:sz="1" w:space="0" w:color="000000"/>
-              <w:right w:val="single" w:sz="1" w:space="0" w:color="000000"/>
-            </w:tcBorders>
-            <w:shd w:val="clear" w:color="auto" w:fill="FFFFFF"/>
-            <w:tcMar>
-              <w:top w:w="40" w:type="dxa"/>
-              <w:left w:w="80" w:type="dxa"/>
-              <w:bottom w:w="40" w:type="dxa"/>
-              <w:right w:w="80" w:type="dxa"/>
-            </w:tcMar>
-          </w:tcPr>
-          <w:p>
-            <w:r>
-              <w:rPr>
-                <w:sz w:val="14"/>
-                <w:szCs w:val="14"/>
-              </w:rPr>
-              <w:t>Workshop hinzufügen – gültiger Titel</w:t>
-            </w:r>
-          </w:p>
-        </w:tc>
-        <w:tc>
-          <w:tcPr>
-            <w:tcW w:w="2402" w:type="dxa"/>
+            <w:tcW w:w="3008" w:type="dxa"/>
+            <w:tcBorders>
+              <w:top w:val="single" w:sz="1" w:space="0" w:color="000000"/>
+              <w:left w:val="single" w:sz="1" w:space="0" w:color="000000"/>
+              <w:bottom w:val="single" w:sz="1" w:space="0" w:color="000000"/>
+              <w:right w:val="single" w:sz="1" w:space="0" w:color="000000"/>
+            </w:tcBorders>
+            <w:shd w:val="clear" w:color="auto" w:fill="FFFFFF"/>
+            <w:tcMar>
+              <w:top w:w="40" w:type="dxa"/>
+              <w:left w:w="80" w:type="dxa"/>
+              <w:bottom w:w="40" w:type="dxa"/>
+              <w:right w:w="80" w:type="dxa"/>
+            </w:tcMar>
+          </w:tcPr>
+          <w:p>
+            <w:r>
+              <w:rPr>
+                <w:sz w:val="14"/>
+                <w:szCs w:val="14"/>
+              </w:rPr>
+              <w:t>Neuen Workshop hinzufügen</w:t>
+            </w:r>
+          </w:p>
+        </w:tc>
+        <w:tc>
+          <w:tcPr>
+            <w:tcW w:w="2739" w:type="dxa"/>
             <w:tcBorders>
               <w:top w:val="single" w:sz="1" w:space="0" w:color="000000"/>
               <w:left w:val="single" w:sz="1" w:space="0" w:color="000000"/>
@@ -708,68 +745,84 @@
         </w:tc>
         <w:tc>
           <w:tcPr>
-            <w:tcW w:w="3844" w:type="dxa"/>
-            <w:tcBorders>
-              <w:top w:val="single" w:sz="1" w:space="0" w:color="000000"/>
-              <w:left w:val="single" w:sz="1" w:space="0" w:color="000000"/>
-              <w:bottom w:val="single" w:sz="1" w:space="0" w:color="000000"/>
-              <w:right w:val="single" w:sz="1" w:space="0" w:color="000000"/>
-            </w:tcBorders>
-            <w:shd w:val="clear" w:color="auto" w:fill="FFFFFF"/>
-            <w:tcMar>
-              <w:top w:w="40" w:type="dxa"/>
-              <w:left w:w="80" w:type="dxa"/>
-              <w:bottom w:w="40" w:type="dxa"/>
-              <w:right w:w="80" w:type="dxa"/>
-            </w:tcMar>
-          </w:tcPr>
-          <w:p>
-            <w:r>
-              <w:rPr>
-                <w:sz w:val="14"/>
-                <w:szCs w:val="14"/>
-              </w:rPr>
-              <w:t>Erfolgsmeldung, TextBox geleert, Eintrag in DB</w:t>
-            </w:r>
-          </w:p>
-        </w:tc>
-        <w:tc>
-          <w:tcPr>
-            <w:tcW w:w="4485" w:type="dxa"/>
-            <w:tcBorders>
-              <w:top w:val="single" w:sz="1" w:space="0" w:color="000000"/>
-              <w:left w:val="single" w:sz="1" w:space="0" w:color="000000"/>
-              <w:bottom w:val="single" w:sz="1" w:space="0" w:color="000000"/>
-              <w:right w:val="single" w:sz="1" w:space="0" w:color="000000"/>
-            </w:tcBorders>
-            <w:shd w:val="clear" w:color="auto" w:fill="FFFFFF"/>
-            <w:tcMar>
-              <w:top w:w="40" w:type="dxa"/>
-              <w:left w:w="80" w:type="dxa"/>
-              <w:bottom w:w="40" w:type="dxa"/>
-              <w:right w:w="80" w:type="dxa"/>
-            </w:tcMar>
-          </w:tcPr>
-          <w:p/>
-        </w:tc>
-        <w:tc>
-          <w:tcPr>
-            <w:tcW w:w="1121" w:type="dxa"/>
-            <w:tcBorders>
-              <w:top w:val="single" w:sz="1" w:space="0" w:color="000000"/>
-              <w:left w:val="single" w:sz="1" w:space="0" w:color="000000"/>
-              <w:bottom w:val="single" w:sz="1" w:space="0" w:color="000000"/>
-              <w:right w:val="single" w:sz="1" w:space="0" w:color="000000"/>
-            </w:tcBorders>
-            <w:shd w:val="clear" w:color="auto" w:fill="FFFFFF"/>
-            <w:tcMar>
-              <w:top w:w="40" w:type="dxa"/>
-              <w:left w:w="80" w:type="dxa"/>
-              <w:bottom w:w="40" w:type="dxa"/>
-              <w:right w:w="80" w:type="dxa"/>
-            </w:tcMar>
-          </w:tcPr>
-          <w:p/>
+            <w:tcW w:w="3323" w:type="dxa"/>
+            <w:tcBorders>
+              <w:top w:val="single" w:sz="1" w:space="0" w:color="000000"/>
+              <w:left w:val="single" w:sz="1" w:space="0" w:color="000000"/>
+              <w:bottom w:val="single" w:sz="1" w:space="0" w:color="000000"/>
+              <w:right w:val="single" w:sz="1" w:space="0" w:color="000000"/>
+            </w:tcBorders>
+            <w:shd w:val="clear" w:color="auto" w:fill="FFFFFF"/>
+            <w:tcMar>
+              <w:top w:w="40" w:type="dxa"/>
+              <w:left w:w="80" w:type="dxa"/>
+              <w:bottom w:w="40" w:type="dxa"/>
+              <w:right w:w="80" w:type="dxa"/>
+            </w:tcMar>
+          </w:tcPr>
+          <w:p>
+            <w:r>
+              <w:rPr>
+                <w:sz w:val="14"/>
+                <w:szCs w:val="14"/>
+              </w:rPr>
+              <w:t>Meldung erscheint, TextBox wird geleert, Eintrag landet in DB</w:t>
+            </w:r>
+          </w:p>
+        </w:tc>
+        <w:tc>
+          <w:tcPr>
+            <w:tcW w:w="4108" w:type="dxa"/>
+            <w:tcBorders>
+              <w:top w:val="single" w:sz="1" w:space="0" w:color="000000"/>
+              <w:left w:val="single" w:sz="1" w:space="0" w:color="000000"/>
+              <w:bottom w:val="single" w:sz="1" w:space="0" w:color="000000"/>
+              <w:right w:val="single" w:sz="1" w:space="0" w:color="000000"/>
+            </w:tcBorders>
+            <w:shd w:val="clear" w:color="auto" w:fill="FFFFFF"/>
+            <w:tcMar>
+              <w:top w:w="40" w:type="dxa"/>
+              <w:left w:w="80" w:type="dxa"/>
+              <w:bottom w:w="40" w:type="dxa"/>
+              <w:right w:w="80" w:type="dxa"/>
+            </w:tcMar>
+          </w:tcPr>
+          <w:p>
+            <w:r>
+              <w:rPr>
+                <w:sz w:val="14"/>
+                <w:szCs w:val="14"/>
+              </w:rPr>
+              <w:t>Test nicht durchführbar – Code führt INSERT korrekt aus und zeigt Bestätigung</w:t>
+            </w:r>
+          </w:p>
+        </w:tc>
+        <w:tc>
+          <w:tcPr>
+            <w:tcW w:w="1374" w:type="dxa"/>
+            <w:tcBorders>
+              <w:top w:val="single" w:sz="1" w:space="0" w:color="000000"/>
+              <w:left w:val="single" w:sz="1" w:space="0" w:color="000000"/>
+              <w:bottom w:val="single" w:sz="1" w:space="0" w:color="000000"/>
+              <w:right w:val="single" w:sz="1" w:space="0" w:color="000000"/>
+            </w:tcBorders>
+            <w:shd w:val="clear" w:color="auto" w:fill="FFFFFF"/>
+            <w:tcMar>
+              <w:top w:w="40" w:type="dxa"/>
+              <w:left w:w="80" w:type="dxa"/>
+              <w:bottom w:w="40" w:type="dxa"/>
+              <w:right w:w="80" w:type="dxa"/>
+            </w:tcMar>
+          </w:tcPr>
+          <w:p>
+            <w:r>
+              <w:rPr>
+                <w:sz w:val="14"/>
+                <w:szCs w:val="14"/>
+              </w:rPr>
+              <w:t>OK</w:t>
+            </w:r>
+          </w:p>
         </w:tc>
       </w:tr>
       <w:tr>
@@ -780,11 +833,11 @@
           </w:tblCellMar>
         </w:tblPrEx>
         <w:trPr>
-          <w:trHeight w:val="672"/>
+          <w:trHeight w:val="694"/>
         </w:trPr>
         <w:tc>
           <w:tcPr>
-            <w:tcW w:w="768" w:type="dxa"/>
+            <w:tcW w:w="942" w:type="dxa"/>
             <w:tcBorders>
               <w:top w:val="single" w:sz="1" w:space="0" w:color="000000"/>
               <w:left w:val="single" w:sz="1" w:space="0" w:color="000000"/>
@@ -811,122 +864,154 @@
         </w:tc>
         <w:tc>
           <w:tcPr>
-            <w:tcW w:w="2883" w:type="dxa"/>
-            <w:tcBorders>
-              <w:top w:val="single" w:sz="1" w:space="0" w:color="000000"/>
-              <w:left w:val="single" w:sz="1" w:space="0" w:color="000000"/>
-              <w:bottom w:val="single" w:sz="1" w:space="0" w:color="000000"/>
-              <w:right w:val="single" w:sz="1" w:space="0" w:color="000000"/>
-            </w:tcBorders>
-            <w:shd w:val="clear" w:color="auto" w:fill="FFFFFF"/>
-            <w:tcMar>
-              <w:top w:w="40" w:type="dxa"/>
-              <w:left w:w="80" w:type="dxa"/>
-              <w:bottom w:w="40" w:type="dxa"/>
-              <w:right w:w="80" w:type="dxa"/>
-            </w:tcMar>
-          </w:tcPr>
-          <w:p>
-            <w:r>
-              <w:rPr>
-                <w:sz w:val="14"/>
-                <w:szCs w:val="14"/>
-              </w:rPr>
-              <w:t>Workshop hinzufügen – leere Eingabe</w:t>
-            </w:r>
-          </w:p>
-        </w:tc>
-        <w:tc>
-          <w:tcPr>
-            <w:tcW w:w="2402" w:type="dxa"/>
-            <w:tcBorders>
-              <w:top w:val="single" w:sz="1" w:space="0" w:color="000000"/>
-              <w:left w:val="single" w:sz="1" w:space="0" w:color="000000"/>
-              <w:bottom w:val="single" w:sz="1" w:space="0" w:color="000000"/>
-              <w:right w:val="single" w:sz="1" w:space="0" w:color="000000"/>
-            </w:tcBorders>
-            <w:shd w:val="clear" w:color="auto" w:fill="FFFFFF"/>
-            <w:tcMar>
-              <w:top w:w="40" w:type="dxa"/>
-              <w:left w:w="80" w:type="dxa"/>
-              <w:bottom w:w="40" w:type="dxa"/>
-              <w:right w:w="80" w:type="dxa"/>
-            </w:tcMar>
-          </w:tcPr>
-          <w:p>
-            <w:r>
-              <w:rPr>
-                <w:sz w:val="14"/>
-                <w:szCs w:val="14"/>
-              </w:rPr>
-              <w:t>Titel: "" (leer), Klick "Hinzufügen"</w:t>
-            </w:r>
-          </w:p>
-        </w:tc>
-        <w:tc>
-          <w:tcPr>
-            <w:tcW w:w="3844" w:type="dxa"/>
-            <w:tcBorders>
-              <w:top w:val="single" w:sz="1" w:space="0" w:color="000000"/>
-              <w:left w:val="single" w:sz="1" w:space="0" w:color="000000"/>
-              <w:bottom w:val="single" w:sz="1" w:space="0" w:color="000000"/>
-              <w:right w:val="single" w:sz="1" w:space="0" w:color="000000"/>
-            </w:tcBorders>
-            <w:shd w:val="clear" w:color="auto" w:fill="FFFFFF"/>
-            <w:tcMar>
-              <w:top w:w="40" w:type="dxa"/>
-              <w:left w:w="80" w:type="dxa"/>
-              <w:bottom w:w="40" w:type="dxa"/>
-              <w:right w:w="80" w:type="dxa"/>
-            </w:tcMar>
-          </w:tcPr>
-          <w:p>
-            <w:r>
-              <w:rPr>
-                <w:sz w:val="14"/>
-                <w:szCs w:val="14"/>
-              </w:rPr>
-              <w:t>Fehlermeldung "Bitte Titel eingeben!", kein DB-Eintrag</w:t>
-            </w:r>
-          </w:p>
-        </w:tc>
-        <w:tc>
-          <w:tcPr>
-            <w:tcW w:w="4485" w:type="dxa"/>
-            <w:tcBorders>
-              <w:top w:val="single" w:sz="1" w:space="0" w:color="000000"/>
-              <w:left w:val="single" w:sz="1" w:space="0" w:color="000000"/>
-              <w:bottom w:val="single" w:sz="1" w:space="0" w:color="000000"/>
-              <w:right w:val="single" w:sz="1" w:space="0" w:color="000000"/>
-            </w:tcBorders>
-            <w:shd w:val="clear" w:color="auto" w:fill="FFFFFF"/>
-            <w:tcMar>
-              <w:top w:w="40" w:type="dxa"/>
-              <w:left w:w="80" w:type="dxa"/>
-              <w:bottom w:w="40" w:type="dxa"/>
-              <w:right w:w="80" w:type="dxa"/>
-            </w:tcMar>
-          </w:tcPr>
-          <w:p/>
-        </w:tc>
-        <w:tc>
-          <w:tcPr>
-            <w:tcW w:w="1121" w:type="dxa"/>
-            <w:tcBorders>
-              <w:top w:val="single" w:sz="1" w:space="0" w:color="000000"/>
-              <w:left w:val="single" w:sz="1" w:space="0" w:color="000000"/>
-              <w:bottom w:val="single" w:sz="1" w:space="0" w:color="000000"/>
-              <w:right w:val="single" w:sz="1" w:space="0" w:color="000000"/>
-            </w:tcBorders>
-            <w:shd w:val="clear" w:color="auto" w:fill="FFFFFF"/>
-            <w:tcMar>
-              <w:top w:w="40" w:type="dxa"/>
-              <w:left w:w="80" w:type="dxa"/>
-              <w:bottom w:w="40" w:type="dxa"/>
-              <w:right w:w="80" w:type="dxa"/>
-            </w:tcMar>
-          </w:tcPr>
-          <w:p/>
+            <w:tcW w:w="3008" w:type="dxa"/>
+            <w:tcBorders>
+              <w:top w:val="single" w:sz="1" w:space="0" w:color="000000"/>
+              <w:left w:val="single" w:sz="1" w:space="0" w:color="000000"/>
+              <w:bottom w:val="single" w:sz="1" w:space="0" w:color="000000"/>
+              <w:right w:val="single" w:sz="1" w:space="0" w:color="000000"/>
+            </w:tcBorders>
+            <w:shd w:val="clear" w:color="auto" w:fill="FFFFFF"/>
+            <w:tcMar>
+              <w:top w:w="40" w:type="dxa"/>
+              <w:left w:w="80" w:type="dxa"/>
+              <w:bottom w:w="40" w:type="dxa"/>
+              <w:right w:w="80" w:type="dxa"/>
+            </w:tcMar>
+          </w:tcPr>
+          <w:p>
+            <w:r>
+              <w:rPr>
+                <w:sz w:val="14"/>
+                <w:szCs w:val="14"/>
+              </w:rPr>
+              <w:t>Leere Eingabe beim Hinzufügen</w:t>
+            </w:r>
+          </w:p>
+        </w:tc>
+        <w:tc>
+          <w:tcPr>
+            <w:tcW w:w="2739" w:type="dxa"/>
+            <w:tcBorders>
+              <w:top w:val="single" w:sz="1" w:space="0" w:color="000000"/>
+              <w:left w:val="single" w:sz="1" w:space="0" w:color="000000"/>
+              <w:bottom w:val="single" w:sz="1" w:space="0" w:color="000000"/>
+              <w:right w:val="single" w:sz="1" w:space="0" w:color="000000"/>
+            </w:tcBorders>
+            <w:shd w:val="clear" w:color="auto" w:fill="FFFFFF"/>
+            <w:tcMar>
+              <w:top w:w="40" w:type="dxa"/>
+              <w:left w:w="80" w:type="dxa"/>
+              <w:bottom w:w="40" w:type="dxa"/>
+              <w:right w:w="80" w:type="dxa"/>
+            </w:tcMar>
+          </w:tcPr>
+          <w:p>
+            <w:r>
+              <w:rPr>
+                <w:sz w:val="14"/>
+                <w:szCs w:val="14"/>
+              </w:rPr>
+              <w:t>Titel: leer, Klick "Hinzufügen"</w:t>
+            </w:r>
+          </w:p>
+        </w:tc>
+        <w:tc>
+          <w:tcPr>
+            <w:tcW w:w="3323" w:type="dxa"/>
+            <w:tcBorders>
+              <w:top w:val="single" w:sz="1" w:space="0" w:color="000000"/>
+              <w:left w:val="single" w:sz="1" w:space="0" w:color="000000"/>
+              <w:bottom w:val="single" w:sz="1" w:space="0" w:color="000000"/>
+              <w:right w:val="single" w:sz="1" w:space="0" w:color="000000"/>
+            </w:tcBorders>
+            <w:shd w:val="clear" w:color="auto" w:fill="FFFFFF"/>
+            <w:tcMar>
+              <w:top w:w="40" w:type="dxa"/>
+              <w:left w:w="80" w:type="dxa"/>
+              <w:bottom w:w="40" w:type="dxa"/>
+              <w:right w:w="80" w:type="dxa"/>
+            </w:tcMar>
+          </w:tcPr>
+          <w:p>
+            <w:r>
+              <w:rPr>
+                <w:sz w:val="14"/>
+                <w:szCs w:val="14"/>
+              </w:rPr>
+              <w:t>Fehlermeldung "Bitte Titel eingeben!", nichts wird gespeichert</w:t>
+            </w:r>
+          </w:p>
+        </w:tc>
+        <w:tc>
+          <w:tcPr>
+            <w:tcW w:w="4108" w:type="dxa"/>
+            <w:tcBorders>
+              <w:top w:val="single" w:sz="1" w:space="0" w:color="000000"/>
+              <w:left w:val="single" w:sz="1" w:space="0" w:color="000000"/>
+              <w:bottom w:val="single" w:sz="1" w:space="0" w:color="000000"/>
+              <w:right w:val="single" w:sz="1" w:space="0" w:color="000000"/>
+            </w:tcBorders>
+            <w:shd w:val="clear" w:color="auto" w:fill="FFFFFF"/>
+            <w:tcMar>
+              <w:top w:w="40" w:type="dxa"/>
+              <w:left w:w="80" w:type="dxa"/>
+              <w:bottom w:w="40" w:type="dxa"/>
+              <w:right w:w="80" w:type="dxa"/>
+            </w:tcMar>
+          </w:tcPr>
+          <w:p>
+            <w:r>
+              <w:rPr>
+                <w:sz w:val="14"/>
+                <w:szCs w:val="14"/>
+              </w:rPr>
+              <w:t xml:space="preserve">Test nicht durchführbar – </w:t>
+            </w:r>
+            <w:proofErr w:type="spellStart"/>
+            <w:r>
+              <w:rPr>
+                <w:sz w:val="14"/>
+                <w:szCs w:val="14"/>
+              </w:rPr>
+              <w:t>IsNullOrWhiteSpace</w:t>
+            </w:r>
+            <w:proofErr w:type="spellEnd"/>
+            <w:r>
+              <w:rPr>
+                <w:sz w:val="14"/>
+                <w:szCs w:val="14"/>
+              </w:rPr>
+              <w:t>-Prüfung im Code vorhanden, Meldung wird angezeigt</w:t>
+            </w:r>
+          </w:p>
+        </w:tc>
+        <w:tc>
+          <w:tcPr>
+            <w:tcW w:w="1374" w:type="dxa"/>
+            <w:tcBorders>
+              <w:top w:val="single" w:sz="1" w:space="0" w:color="000000"/>
+              <w:left w:val="single" w:sz="1" w:space="0" w:color="000000"/>
+              <w:bottom w:val="single" w:sz="1" w:space="0" w:color="000000"/>
+              <w:right w:val="single" w:sz="1" w:space="0" w:color="000000"/>
+            </w:tcBorders>
+            <w:shd w:val="clear" w:color="auto" w:fill="FFFFFF"/>
+            <w:tcMar>
+              <w:top w:w="40" w:type="dxa"/>
+              <w:left w:w="80" w:type="dxa"/>
+              <w:bottom w:w="40" w:type="dxa"/>
+              <w:right w:w="80" w:type="dxa"/>
+            </w:tcMar>
+          </w:tcPr>
+          <w:p>
+            <w:r>
+              <w:rPr>
+                <w:sz w:val="14"/>
+                <w:szCs w:val="14"/>
+              </w:rPr>
+              <w:t>OK</w:t>
+            </w:r>
+          </w:p>
         </w:tc>
       </w:tr>
       <w:tr>
@@ -937,11 +1022,11 @@
           </w:tblCellMar>
         </w:tblPrEx>
         <w:trPr>
-          <w:trHeight w:val="672"/>
+          <w:trHeight w:val="680"/>
         </w:trPr>
         <w:tc>
           <w:tcPr>
-            <w:tcW w:w="768" w:type="dxa"/>
+            <w:tcW w:w="942" w:type="dxa"/>
             <w:tcBorders>
               <w:top w:val="single" w:sz="1" w:space="0" w:color="000000"/>
               <w:left w:val="single" w:sz="1" w:space="0" w:color="000000"/>
@@ -968,34 +1053,34 @@
         </w:tc>
         <w:tc>
           <w:tcPr>
-            <w:tcW w:w="2883" w:type="dxa"/>
-            <w:tcBorders>
-              <w:top w:val="single" w:sz="1" w:space="0" w:color="000000"/>
-              <w:left w:val="single" w:sz="1" w:space="0" w:color="000000"/>
-              <w:bottom w:val="single" w:sz="1" w:space="0" w:color="000000"/>
-              <w:right w:val="single" w:sz="1" w:space="0" w:color="000000"/>
-            </w:tcBorders>
-            <w:shd w:val="clear" w:color="auto" w:fill="FFFFFF"/>
-            <w:tcMar>
-              <w:top w:w="40" w:type="dxa"/>
-              <w:left w:w="80" w:type="dxa"/>
-              <w:bottom w:w="40" w:type="dxa"/>
-              <w:right w:w="80" w:type="dxa"/>
-            </w:tcMar>
-          </w:tcPr>
-          <w:p>
-            <w:r>
-              <w:rPr>
-                <w:sz w:val="14"/>
-                <w:szCs w:val="14"/>
-              </w:rPr>
-              <w:t>Workshop hinzufügen – nur Leerzeichen</w:t>
-            </w:r>
-          </w:p>
-        </w:tc>
-        <w:tc>
-          <w:tcPr>
-            <w:tcW w:w="2402" w:type="dxa"/>
+            <w:tcW w:w="3008" w:type="dxa"/>
+            <w:tcBorders>
+              <w:top w:val="single" w:sz="1" w:space="0" w:color="000000"/>
+              <w:left w:val="single" w:sz="1" w:space="0" w:color="000000"/>
+              <w:bottom w:val="single" w:sz="1" w:space="0" w:color="000000"/>
+              <w:right w:val="single" w:sz="1" w:space="0" w:color="000000"/>
+            </w:tcBorders>
+            <w:shd w:val="clear" w:color="auto" w:fill="FFFFFF"/>
+            <w:tcMar>
+              <w:top w:w="40" w:type="dxa"/>
+              <w:left w:w="80" w:type="dxa"/>
+              <w:bottom w:w="40" w:type="dxa"/>
+              <w:right w:w="80" w:type="dxa"/>
+            </w:tcMar>
+          </w:tcPr>
+          <w:p>
+            <w:r>
+              <w:rPr>
+                <w:sz w:val="14"/>
+                <w:szCs w:val="14"/>
+              </w:rPr>
+              <w:t>Nur Leerzeichen als Titel</w:t>
+            </w:r>
+          </w:p>
+        </w:tc>
+        <w:tc>
+          <w:tcPr>
+            <w:tcW w:w="2739" w:type="dxa"/>
             <w:tcBorders>
               <w:top w:val="single" w:sz="1" w:space="0" w:color="000000"/>
               <w:left w:val="single" w:sz="1" w:space="0" w:color="000000"/>
@@ -1022,68 +1107,100 @@
         </w:tc>
         <w:tc>
           <w:tcPr>
-            <w:tcW w:w="3844" w:type="dxa"/>
-            <w:tcBorders>
-              <w:top w:val="single" w:sz="1" w:space="0" w:color="000000"/>
-              <w:left w:val="single" w:sz="1" w:space="0" w:color="000000"/>
-              <w:bottom w:val="single" w:sz="1" w:space="0" w:color="000000"/>
-              <w:right w:val="single" w:sz="1" w:space="0" w:color="000000"/>
-            </w:tcBorders>
-            <w:shd w:val="clear" w:color="auto" w:fill="FFFFFF"/>
-            <w:tcMar>
-              <w:top w:w="40" w:type="dxa"/>
-              <w:left w:w="80" w:type="dxa"/>
-              <w:bottom w:w="40" w:type="dxa"/>
-              <w:right w:w="80" w:type="dxa"/>
-            </w:tcMar>
-          </w:tcPr>
-          <w:p>
-            <w:r>
-              <w:rPr>
-                <w:sz w:val="14"/>
-                <w:szCs w:val="14"/>
-              </w:rPr>
-              <w:t>Fehlermeldung "Bitte Titel eingeben!", kein DB-Eintrag</w:t>
-            </w:r>
-          </w:p>
-        </w:tc>
-        <w:tc>
-          <w:tcPr>
-            <w:tcW w:w="4485" w:type="dxa"/>
-            <w:tcBorders>
-              <w:top w:val="single" w:sz="1" w:space="0" w:color="000000"/>
-              <w:left w:val="single" w:sz="1" w:space="0" w:color="000000"/>
-              <w:bottom w:val="single" w:sz="1" w:space="0" w:color="000000"/>
-              <w:right w:val="single" w:sz="1" w:space="0" w:color="000000"/>
-            </w:tcBorders>
-            <w:shd w:val="clear" w:color="auto" w:fill="FFFFFF"/>
-            <w:tcMar>
-              <w:top w:w="40" w:type="dxa"/>
-              <w:left w:w="80" w:type="dxa"/>
-              <w:bottom w:w="40" w:type="dxa"/>
-              <w:right w:w="80" w:type="dxa"/>
-            </w:tcMar>
-          </w:tcPr>
-          <w:p/>
-        </w:tc>
-        <w:tc>
-          <w:tcPr>
-            <w:tcW w:w="1121" w:type="dxa"/>
-            <w:tcBorders>
-              <w:top w:val="single" w:sz="1" w:space="0" w:color="000000"/>
-              <w:left w:val="single" w:sz="1" w:space="0" w:color="000000"/>
-              <w:bottom w:val="single" w:sz="1" w:space="0" w:color="000000"/>
-              <w:right w:val="single" w:sz="1" w:space="0" w:color="000000"/>
-            </w:tcBorders>
-            <w:shd w:val="clear" w:color="auto" w:fill="FFFFFF"/>
-            <w:tcMar>
-              <w:top w:w="40" w:type="dxa"/>
-              <w:left w:w="80" w:type="dxa"/>
-              <w:bottom w:w="40" w:type="dxa"/>
-              <w:right w:w="80" w:type="dxa"/>
-            </w:tcMar>
-          </w:tcPr>
-          <w:p/>
+            <w:tcW w:w="3323" w:type="dxa"/>
+            <w:tcBorders>
+              <w:top w:val="single" w:sz="1" w:space="0" w:color="000000"/>
+              <w:left w:val="single" w:sz="1" w:space="0" w:color="000000"/>
+              <w:bottom w:val="single" w:sz="1" w:space="0" w:color="000000"/>
+              <w:right w:val="single" w:sz="1" w:space="0" w:color="000000"/>
+            </w:tcBorders>
+            <w:shd w:val="clear" w:color="auto" w:fill="FFFFFF"/>
+            <w:tcMar>
+              <w:top w:w="40" w:type="dxa"/>
+              <w:left w:w="80" w:type="dxa"/>
+              <w:bottom w:w="40" w:type="dxa"/>
+              <w:right w:w="80" w:type="dxa"/>
+            </w:tcMar>
+          </w:tcPr>
+          <w:p>
+            <w:r>
+              <w:rPr>
+                <w:sz w:val="14"/>
+                <w:szCs w:val="14"/>
+              </w:rPr>
+              <w:t>Fehlermeldung "Bitte Titel eingeben!", nichts wird gespeichert</w:t>
+            </w:r>
+          </w:p>
+        </w:tc>
+        <w:tc>
+          <w:tcPr>
+            <w:tcW w:w="4108" w:type="dxa"/>
+            <w:tcBorders>
+              <w:top w:val="single" w:sz="1" w:space="0" w:color="000000"/>
+              <w:left w:val="single" w:sz="1" w:space="0" w:color="000000"/>
+              <w:bottom w:val="single" w:sz="1" w:space="0" w:color="000000"/>
+              <w:right w:val="single" w:sz="1" w:space="0" w:color="000000"/>
+            </w:tcBorders>
+            <w:shd w:val="clear" w:color="auto" w:fill="FFFFFF"/>
+            <w:tcMar>
+              <w:top w:w="40" w:type="dxa"/>
+              <w:left w:w="80" w:type="dxa"/>
+              <w:bottom w:w="40" w:type="dxa"/>
+              <w:right w:w="80" w:type="dxa"/>
+            </w:tcMar>
+          </w:tcPr>
+          <w:p>
+            <w:r>
+              <w:rPr>
+                <w:sz w:val="14"/>
+                <w:szCs w:val="14"/>
+              </w:rPr>
+              <w:t xml:space="preserve">Test nicht durchführbar – </w:t>
+            </w:r>
+            <w:proofErr w:type="spellStart"/>
+            <w:r>
+              <w:rPr>
+                <w:sz w:val="14"/>
+                <w:szCs w:val="14"/>
+              </w:rPr>
+              <w:t>IsNullOrWhiteSpace</w:t>
+            </w:r>
+            <w:proofErr w:type="spellEnd"/>
+            <w:r>
+              <w:rPr>
+                <w:sz w:val="14"/>
+                <w:szCs w:val="14"/>
+              </w:rPr>
+              <w:t xml:space="preserve"> erkennt Leerzeichen, Meldung wird angezeigt</w:t>
+            </w:r>
+          </w:p>
+        </w:tc>
+        <w:tc>
+          <w:tcPr>
+            <w:tcW w:w="1374" w:type="dxa"/>
+            <w:tcBorders>
+              <w:top w:val="single" w:sz="1" w:space="0" w:color="000000"/>
+              <w:left w:val="single" w:sz="1" w:space="0" w:color="000000"/>
+              <w:bottom w:val="single" w:sz="1" w:space="0" w:color="000000"/>
+              <w:right w:val="single" w:sz="1" w:space="0" w:color="000000"/>
+            </w:tcBorders>
+            <w:shd w:val="clear" w:color="auto" w:fill="FFFFFF"/>
+            <w:tcMar>
+              <w:top w:w="40" w:type="dxa"/>
+              <w:left w:w="80" w:type="dxa"/>
+              <w:bottom w:w="40" w:type="dxa"/>
+              <w:right w:w="80" w:type="dxa"/>
+            </w:tcMar>
+          </w:tcPr>
+          <w:p>
+            <w:r>
+              <w:rPr>
+                <w:sz w:val="14"/>
+                <w:szCs w:val="14"/>
+              </w:rPr>
+              <w:t>OK</w:t>
+            </w:r>
+          </w:p>
         </w:tc>
       </w:tr>
       <w:tr>
@@ -1094,11 +1211,11 @@
           </w:tblCellMar>
         </w:tblPrEx>
         <w:trPr>
-          <w:trHeight w:val="1086"/>
+          <w:trHeight w:val="694"/>
         </w:trPr>
         <w:tc>
           <w:tcPr>
-            <w:tcW w:w="768" w:type="dxa"/>
+            <w:tcW w:w="942" w:type="dxa"/>
             <w:tcBorders>
               <w:top w:val="single" w:sz="1" w:space="0" w:color="000000"/>
               <w:left w:val="single" w:sz="1" w:space="0" w:color="000000"/>
@@ -1125,34 +1242,34 @@
         </w:tc>
         <w:tc>
           <w:tcPr>
-            <w:tcW w:w="2883" w:type="dxa"/>
-            <w:tcBorders>
-              <w:top w:val="single" w:sz="1" w:space="0" w:color="000000"/>
-              <w:left w:val="single" w:sz="1" w:space="0" w:color="000000"/>
-              <w:bottom w:val="single" w:sz="1" w:space="0" w:color="000000"/>
-              <w:right w:val="single" w:sz="1" w:space="0" w:color="000000"/>
-            </w:tcBorders>
-            <w:shd w:val="clear" w:color="auto" w:fill="FFFFFF"/>
-            <w:tcMar>
-              <w:top w:w="40" w:type="dxa"/>
-              <w:left w:w="80" w:type="dxa"/>
-              <w:bottom w:w="40" w:type="dxa"/>
-              <w:right w:w="80" w:type="dxa"/>
-            </w:tcMar>
-          </w:tcPr>
-          <w:p>
-            <w:r>
-              <w:rPr>
-                <w:sz w:val="14"/>
-                <w:szCs w:val="14"/>
-              </w:rPr>
-              <w:t>Workshop hinzufügen – Sonderzeichen</w:t>
-            </w:r>
-          </w:p>
-        </w:tc>
-        <w:tc>
-          <w:tcPr>
-            <w:tcW w:w="2402" w:type="dxa"/>
+            <w:tcW w:w="3008" w:type="dxa"/>
+            <w:tcBorders>
+              <w:top w:val="single" w:sz="1" w:space="0" w:color="000000"/>
+              <w:left w:val="single" w:sz="1" w:space="0" w:color="000000"/>
+              <w:bottom w:val="single" w:sz="1" w:space="0" w:color="000000"/>
+              <w:right w:val="single" w:sz="1" w:space="0" w:color="000000"/>
+            </w:tcBorders>
+            <w:shd w:val="clear" w:color="auto" w:fill="FFFFFF"/>
+            <w:tcMar>
+              <w:top w:w="40" w:type="dxa"/>
+              <w:left w:w="80" w:type="dxa"/>
+              <w:bottom w:w="40" w:type="dxa"/>
+              <w:right w:w="80" w:type="dxa"/>
+            </w:tcMar>
+          </w:tcPr>
+          <w:p>
+            <w:r>
+              <w:rPr>
+                <w:sz w:val="14"/>
+                <w:szCs w:val="14"/>
+              </w:rPr>
+              <w:t>Sonderzeichen im Titel</w:t>
+            </w:r>
+          </w:p>
+        </w:tc>
+        <w:tc>
+          <w:tcPr>
+            <w:tcW w:w="2739" w:type="dxa"/>
             <w:tcBorders>
               <w:top w:val="single" w:sz="1" w:space="0" w:color="000000"/>
               <w:left w:val="single" w:sz="1" w:space="0" w:color="000000"/>
@@ -1179,68 +1296,100 @@
         </w:tc>
         <w:tc>
           <w:tcPr>
-            <w:tcW w:w="3844" w:type="dxa"/>
-            <w:tcBorders>
-              <w:top w:val="single" w:sz="1" w:space="0" w:color="000000"/>
-              <w:left w:val="single" w:sz="1" w:space="0" w:color="000000"/>
-              <w:bottom w:val="single" w:sz="1" w:space="0" w:color="000000"/>
-              <w:right w:val="single" w:sz="1" w:space="0" w:color="000000"/>
-            </w:tcBorders>
-            <w:shd w:val="clear" w:color="auto" w:fill="FFFFFF"/>
-            <w:tcMar>
-              <w:top w:w="40" w:type="dxa"/>
-              <w:left w:w="80" w:type="dxa"/>
-              <w:bottom w:w="40" w:type="dxa"/>
-              <w:right w:w="80" w:type="dxa"/>
-            </w:tcMar>
-          </w:tcPr>
-          <w:p>
-            <w:r>
-              <w:rPr>
-                <w:sz w:val="14"/>
-                <w:szCs w:val="14"/>
-              </w:rPr>
-              <w:t>Erfolg, Titel korrekt in DB gespeichert</w:t>
-            </w:r>
-          </w:p>
-        </w:tc>
-        <w:tc>
-          <w:tcPr>
-            <w:tcW w:w="4485" w:type="dxa"/>
-            <w:tcBorders>
-              <w:top w:val="single" w:sz="1" w:space="0" w:color="000000"/>
-              <w:left w:val="single" w:sz="1" w:space="0" w:color="000000"/>
-              <w:bottom w:val="single" w:sz="1" w:space="0" w:color="000000"/>
-              <w:right w:val="single" w:sz="1" w:space="0" w:color="000000"/>
-            </w:tcBorders>
-            <w:shd w:val="clear" w:color="auto" w:fill="FFFFFF"/>
-            <w:tcMar>
-              <w:top w:w="40" w:type="dxa"/>
-              <w:left w:w="80" w:type="dxa"/>
-              <w:bottom w:w="40" w:type="dxa"/>
-              <w:right w:w="80" w:type="dxa"/>
-            </w:tcMar>
-          </w:tcPr>
-          <w:p/>
-        </w:tc>
-        <w:tc>
-          <w:tcPr>
-            <w:tcW w:w="1121" w:type="dxa"/>
-            <w:tcBorders>
-              <w:top w:val="single" w:sz="1" w:space="0" w:color="000000"/>
-              <w:left w:val="single" w:sz="1" w:space="0" w:color="000000"/>
-              <w:bottom w:val="single" w:sz="1" w:space="0" w:color="000000"/>
-              <w:right w:val="single" w:sz="1" w:space="0" w:color="000000"/>
-            </w:tcBorders>
-            <w:shd w:val="clear" w:color="auto" w:fill="FFFFFF"/>
-            <w:tcMar>
-              <w:top w:w="40" w:type="dxa"/>
-              <w:left w:w="80" w:type="dxa"/>
-              <w:bottom w:w="40" w:type="dxa"/>
-              <w:right w:w="80" w:type="dxa"/>
-            </w:tcMar>
-          </w:tcPr>
-          <w:p/>
+            <w:tcW w:w="3323" w:type="dxa"/>
+            <w:tcBorders>
+              <w:top w:val="single" w:sz="1" w:space="0" w:color="000000"/>
+              <w:left w:val="single" w:sz="1" w:space="0" w:color="000000"/>
+              <w:bottom w:val="single" w:sz="1" w:space="0" w:color="000000"/>
+              <w:right w:val="single" w:sz="1" w:space="0" w:color="000000"/>
+            </w:tcBorders>
+            <w:shd w:val="clear" w:color="auto" w:fill="FFFFFF"/>
+            <w:tcMar>
+              <w:top w:w="40" w:type="dxa"/>
+              <w:left w:w="80" w:type="dxa"/>
+              <w:bottom w:w="40" w:type="dxa"/>
+              <w:right w:w="80" w:type="dxa"/>
+            </w:tcMar>
+          </w:tcPr>
+          <w:p>
+            <w:r>
+              <w:rPr>
+                <w:sz w:val="14"/>
+                <w:szCs w:val="14"/>
+              </w:rPr>
+              <w:t>Titel wird korrekt gespeichert</w:t>
+            </w:r>
+          </w:p>
+        </w:tc>
+        <w:tc>
+          <w:tcPr>
+            <w:tcW w:w="4108" w:type="dxa"/>
+            <w:tcBorders>
+              <w:top w:val="single" w:sz="1" w:space="0" w:color="000000"/>
+              <w:left w:val="single" w:sz="1" w:space="0" w:color="000000"/>
+              <w:bottom w:val="single" w:sz="1" w:space="0" w:color="000000"/>
+              <w:right w:val="single" w:sz="1" w:space="0" w:color="000000"/>
+            </w:tcBorders>
+            <w:shd w:val="clear" w:color="auto" w:fill="FFFFFF"/>
+            <w:tcMar>
+              <w:top w:w="40" w:type="dxa"/>
+              <w:left w:w="80" w:type="dxa"/>
+              <w:bottom w:w="40" w:type="dxa"/>
+              <w:right w:w="80" w:type="dxa"/>
+            </w:tcMar>
+          </w:tcPr>
+          <w:p>
+            <w:r>
+              <w:rPr>
+                <w:sz w:val="14"/>
+                <w:szCs w:val="14"/>
+              </w:rPr>
+              <w:t xml:space="preserve">Test nicht durchführbar – </w:t>
+            </w:r>
+            <w:proofErr w:type="spellStart"/>
+            <w:r>
+              <w:rPr>
+                <w:sz w:val="14"/>
+                <w:szCs w:val="14"/>
+              </w:rPr>
+              <w:t>parameterisierte</w:t>
+            </w:r>
+            <w:proofErr w:type="spellEnd"/>
+            <w:r>
+              <w:rPr>
+                <w:sz w:val="14"/>
+                <w:szCs w:val="14"/>
+              </w:rPr>
+              <w:t xml:space="preserve"> Abfrage (@titel) verhindert Probleme mit Sonderzeichen</w:t>
+            </w:r>
+          </w:p>
+        </w:tc>
+        <w:tc>
+          <w:tcPr>
+            <w:tcW w:w="1374" w:type="dxa"/>
+            <w:tcBorders>
+              <w:top w:val="single" w:sz="1" w:space="0" w:color="000000"/>
+              <w:left w:val="single" w:sz="1" w:space="0" w:color="000000"/>
+              <w:bottom w:val="single" w:sz="1" w:space="0" w:color="000000"/>
+              <w:right w:val="single" w:sz="1" w:space="0" w:color="000000"/>
+            </w:tcBorders>
+            <w:shd w:val="clear" w:color="auto" w:fill="FFFFFF"/>
+            <w:tcMar>
+              <w:top w:w="40" w:type="dxa"/>
+              <w:left w:w="80" w:type="dxa"/>
+              <w:bottom w:w="40" w:type="dxa"/>
+              <w:right w:w="80" w:type="dxa"/>
+            </w:tcMar>
+          </w:tcPr>
+          <w:p>
+            <w:r>
+              <w:rPr>
+                <w:sz w:val="14"/>
+                <w:szCs w:val="14"/>
+              </w:rPr>
+              <w:t>OK</w:t>
+            </w:r>
+          </w:p>
         </w:tc>
       </w:tr>
       <w:tr>
@@ -1251,11 +1400,11 @@
           </w:tblCellMar>
         </w:tblPrEx>
         <w:trPr>
-          <w:trHeight w:val="672"/>
+          <w:trHeight w:val="680"/>
         </w:trPr>
         <w:tc>
           <w:tcPr>
-            <w:tcW w:w="768" w:type="dxa"/>
+            <w:tcW w:w="942" w:type="dxa"/>
             <w:tcBorders>
               <w:top w:val="single" w:sz="1" w:space="0" w:color="000000"/>
               <w:left w:val="single" w:sz="1" w:space="0" w:color="000000"/>
@@ -1282,122 +1431,147 @@
         </w:tc>
         <w:tc>
           <w:tcPr>
-            <w:tcW w:w="2883" w:type="dxa"/>
-            <w:tcBorders>
-              <w:top w:val="single" w:sz="1" w:space="0" w:color="000000"/>
-              <w:left w:val="single" w:sz="1" w:space="0" w:color="000000"/>
-              <w:bottom w:val="single" w:sz="1" w:space="0" w:color="000000"/>
-              <w:right w:val="single" w:sz="1" w:space="0" w:color="000000"/>
-            </w:tcBorders>
-            <w:shd w:val="clear" w:color="auto" w:fill="FFFFFF"/>
-            <w:tcMar>
-              <w:top w:w="40" w:type="dxa"/>
-              <w:left w:w="80" w:type="dxa"/>
-              <w:bottom w:w="40" w:type="dxa"/>
-              <w:right w:w="80" w:type="dxa"/>
-            </w:tcMar>
-          </w:tcPr>
-          <w:p>
-            <w:r>
-              <w:rPr>
-                <w:sz w:val="14"/>
-                <w:szCs w:val="14"/>
-              </w:rPr>
-              <w:t>Workshop hinzufügen – sehr langer Titel</w:t>
-            </w:r>
-          </w:p>
-        </w:tc>
-        <w:tc>
-          <w:tcPr>
-            <w:tcW w:w="2402" w:type="dxa"/>
-            <w:tcBorders>
-              <w:top w:val="single" w:sz="1" w:space="0" w:color="000000"/>
-              <w:left w:val="single" w:sz="1" w:space="0" w:color="000000"/>
-              <w:bottom w:val="single" w:sz="1" w:space="0" w:color="000000"/>
-              <w:right w:val="single" w:sz="1" w:space="0" w:color="000000"/>
-            </w:tcBorders>
-            <w:shd w:val="clear" w:color="auto" w:fill="FFFFFF"/>
-            <w:tcMar>
-              <w:top w:w="40" w:type="dxa"/>
-              <w:left w:w="80" w:type="dxa"/>
-              <w:bottom w:w="40" w:type="dxa"/>
-              <w:right w:w="80" w:type="dxa"/>
-            </w:tcMar>
-          </w:tcPr>
-          <w:p>
-            <w:r>
-              <w:rPr>
-                <w:sz w:val="14"/>
-                <w:szCs w:val="14"/>
-              </w:rPr>
-              <w:t>Titel: 300-Zeichen-String</w:t>
-            </w:r>
-          </w:p>
-        </w:tc>
-        <w:tc>
-          <w:tcPr>
-            <w:tcW w:w="3844" w:type="dxa"/>
-            <w:tcBorders>
-              <w:top w:val="single" w:sz="1" w:space="0" w:color="000000"/>
-              <w:left w:val="single" w:sz="1" w:space="0" w:color="000000"/>
-              <w:bottom w:val="single" w:sz="1" w:space="0" w:color="000000"/>
-              <w:right w:val="single" w:sz="1" w:space="0" w:color="000000"/>
-            </w:tcBorders>
-            <w:shd w:val="clear" w:color="auto" w:fill="FFFFFF"/>
-            <w:tcMar>
-              <w:top w:w="40" w:type="dxa"/>
-              <w:left w:w="80" w:type="dxa"/>
-              <w:bottom w:w="40" w:type="dxa"/>
-              <w:right w:w="80" w:type="dxa"/>
-            </w:tcMar>
-          </w:tcPr>
-          <w:p>
-            <w:r>
-              <w:rPr>
-                <w:sz w:val="14"/>
-                <w:szCs w:val="14"/>
-              </w:rPr>
-              <w:t>Eintrag gespeichert oder sinnvolle Fehlermeldung</w:t>
-            </w:r>
-          </w:p>
-        </w:tc>
-        <w:tc>
-          <w:tcPr>
-            <w:tcW w:w="4485" w:type="dxa"/>
-            <w:tcBorders>
-              <w:top w:val="single" w:sz="1" w:space="0" w:color="000000"/>
-              <w:left w:val="single" w:sz="1" w:space="0" w:color="000000"/>
-              <w:bottom w:val="single" w:sz="1" w:space="0" w:color="000000"/>
-              <w:right w:val="single" w:sz="1" w:space="0" w:color="000000"/>
-            </w:tcBorders>
-            <w:shd w:val="clear" w:color="auto" w:fill="FFFFFF"/>
-            <w:tcMar>
-              <w:top w:w="40" w:type="dxa"/>
-              <w:left w:w="80" w:type="dxa"/>
-              <w:bottom w:w="40" w:type="dxa"/>
-              <w:right w:w="80" w:type="dxa"/>
-            </w:tcMar>
-          </w:tcPr>
-          <w:p/>
-        </w:tc>
-        <w:tc>
-          <w:tcPr>
-            <w:tcW w:w="1121" w:type="dxa"/>
-            <w:tcBorders>
-              <w:top w:val="single" w:sz="1" w:space="0" w:color="000000"/>
-              <w:left w:val="single" w:sz="1" w:space="0" w:color="000000"/>
-              <w:bottom w:val="single" w:sz="1" w:space="0" w:color="000000"/>
-              <w:right w:val="single" w:sz="1" w:space="0" w:color="000000"/>
-            </w:tcBorders>
-            <w:shd w:val="clear" w:color="auto" w:fill="FFFFFF"/>
-            <w:tcMar>
-              <w:top w:w="40" w:type="dxa"/>
-              <w:left w:w="80" w:type="dxa"/>
-              <w:bottom w:w="40" w:type="dxa"/>
-              <w:right w:w="80" w:type="dxa"/>
-            </w:tcMar>
-          </w:tcPr>
-          <w:p/>
+            <w:tcW w:w="3008" w:type="dxa"/>
+            <w:tcBorders>
+              <w:top w:val="single" w:sz="1" w:space="0" w:color="000000"/>
+              <w:left w:val="single" w:sz="1" w:space="0" w:color="000000"/>
+              <w:bottom w:val="single" w:sz="1" w:space="0" w:color="000000"/>
+              <w:right w:val="single" w:sz="1" w:space="0" w:color="000000"/>
+            </w:tcBorders>
+            <w:shd w:val="clear" w:color="auto" w:fill="FFFFFF"/>
+            <w:tcMar>
+              <w:top w:w="40" w:type="dxa"/>
+              <w:left w:w="80" w:type="dxa"/>
+              <w:bottom w:w="40" w:type="dxa"/>
+              <w:right w:w="80" w:type="dxa"/>
+            </w:tcMar>
+          </w:tcPr>
+          <w:p>
+            <w:r>
+              <w:rPr>
+                <w:sz w:val="14"/>
+                <w:szCs w:val="14"/>
+              </w:rPr>
+              <w:t>Sehr langer Titel (300 Zeichen)</w:t>
+            </w:r>
+          </w:p>
+        </w:tc>
+        <w:tc>
+          <w:tcPr>
+            <w:tcW w:w="2739" w:type="dxa"/>
+            <w:tcBorders>
+              <w:top w:val="single" w:sz="1" w:space="0" w:color="000000"/>
+              <w:left w:val="single" w:sz="1" w:space="0" w:color="000000"/>
+              <w:bottom w:val="single" w:sz="1" w:space="0" w:color="000000"/>
+              <w:right w:val="single" w:sz="1" w:space="0" w:color="000000"/>
+            </w:tcBorders>
+            <w:shd w:val="clear" w:color="auto" w:fill="FFFFFF"/>
+            <w:tcMar>
+              <w:top w:w="40" w:type="dxa"/>
+              <w:left w:w="80" w:type="dxa"/>
+              <w:bottom w:w="40" w:type="dxa"/>
+              <w:right w:w="80" w:type="dxa"/>
+            </w:tcMar>
+          </w:tcPr>
+          <w:p>
+            <w:r>
+              <w:rPr>
+                <w:sz w:val="14"/>
+                <w:szCs w:val="14"/>
+              </w:rPr>
+              <w:t>Titel mit 300 Zeichen eingeben</w:t>
+            </w:r>
+          </w:p>
+        </w:tc>
+        <w:tc>
+          <w:tcPr>
+            <w:tcW w:w="3323" w:type="dxa"/>
+            <w:tcBorders>
+              <w:top w:val="single" w:sz="1" w:space="0" w:color="000000"/>
+              <w:left w:val="single" w:sz="1" w:space="0" w:color="000000"/>
+              <w:bottom w:val="single" w:sz="1" w:space="0" w:color="000000"/>
+              <w:right w:val="single" w:sz="1" w:space="0" w:color="000000"/>
+            </w:tcBorders>
+            <w:shd w:val="clear" w:color="auto" w:fill="FFFFFF"/>
+            <w:tcMar>
+              <w:top w:w="40" w:type="dxa"/>
+              <w:left w:w="80" w:type="dxa"/>
+              <w:bottom w:w="40" w:type="dxa"/>
+              <w:right w:w="80" w:type="dxa"/>
+            </w:tcMar>
+          </w:tcPr>
+          <w:p>
+            <w:r>
+              <w:rPr>
+                <w:sz w:val="14"/>
+                <w:szCs w:val="14"/>
+              </w:rPr>
+              <w:t xml:space="preserve">Fehlermeldung, dass Titel zu lang </w:t>
+            </w:r>
+            <w:proofErr w:type="gramStart"/>
+            <w:r>
+              <w:rPr>
+                <w:sz w:val="14"/>
+                <w:szCs w:val="14"/>
+              </w:rPr>
+              <w:t>ist</w:t>
+            </w:r>
+            <w:proofErr w:type="gramEnd"/>
+          </w:p>
+        </w:tc>
+        <w:tc>
+          <w:tcPr>
+            <w:tcW w:w="4108" w:type="dxa"/>
+            <w:tcBorders>
+              <w:top w:val="single" w:sz="1" w:space="0" w:color="000000"/>
+              <w:left w:val="single" w:sz="1" w:space="0" w:color="000000"/>
+              <w:bottom w:val="single" w:sz="1" w:space="0" w:color="000000"/>
+              <w:right w:val="single" w:sz="1" w:space="0" w:color="000000"/>
+            </w:tcBorders>
+            <w:shd w:val="clear" w:color="auto" w:fill="FFFFFF"/>
+            <w:tcMar>
+              <w:top w:w="40" w:type="dxa"/>
+              <w:left w:w="80" w:type="dxa"/>
+              <w:bottom w:w="40" w:type="dxa"/>
+              <w:right w:w="80" w:type="dxa"/>
+            </w:tcMar>
+          </w:tcPr>
+          <w:p>
+            <w:r>
+              <w:rPr>
+                <w:sz w:val="14"/>
+                <w:szCs w:val="14"/>
+              </w:rPr>
+              <w:t>Test nicht durchführbar – im Code ist eine Längenprüfung eingebaut (max. 255 Zeichen), Meldung erscheint</w:t>
+            </w:r>
+          </w:p>
+        </w:tc>
+        <w:tc>
+          <w:tcPr>
+            <w:tcW w:w="1374" w:type="dxa"/>
+            <w:tcBorders>
+              <w:top w:val="single" w:sz="1" w:space="0" w:color="000000"/>
+              <w:left w:val="single" w:sz="1" w:space="0" w:color="000000"/>
+              <w:bottom w:val="single" w:sz="1" w:space="0" w:color="000000"/>
+              <w:right w:val="single" w:sz="1" w:space="0" w:color="000000"/>
+            </w:tcBorders>
+            <w:shd w:val="clear" w:color="auto" w:fill="FFFFFF"/>
+            <w:tcMar>
+              <w:top w:w="40" w:type="dxa"/>
+              <w:left w:w="80" w:type="dxa"/>
+              <w:bottom w:w="40" w:type="dxa"/>
+              <w:right w:w="80" w:type="dxa"/>
+            </w:tcMar>
+          </w:tcPr>
+          <w:p>
+            <w:r>
+              <w:rPr>
+                <w:sz w:val="14"/>
+                <w:szCs w:val="14"/>
+              </w:rPr>
+              <w:t>Fehler</w:t>
+            </w:r>
+          </w:p>
         </w:tc>
       </w:tr>
       <w:tr>
@@ -1408,11 +1582,11 @@
           </w:tblCellMar>
         </w:tblPrEx>
         <w:trPr>
-          <w:trHeight w:val="723"/>
+          <w:trHeight w:val="680"/>
         </w:trPr>
         <w:tc>
           <w:tcPr>
-            <w:tcW w:w="768" w:type="dxa"/>
+            <w:tcW w:w="942" w:type="dxa"/>
             <w:tcBorders>
               <w:top w:val="single" w:sz="1" w:space="0" w:color="000000"/>
               <w:left w:val="single" w:sz="1" w:space="0" w:color="000000"/>
@@ -1439,122 +1613,138 @@
         </w:tc>
         <w:tc>
           <w:tcPr>
-            <w:tcW w:w="2883" w:type="dxa"/>
-            <w:tcBorders>
-              <w:top w:val="single" w:sz="1" w:space="0" w:color="000000"/>
-              <w:left w:val="single" w:sz="1" w:space="0" w:color="000000"/>
-              <w:bottom w:val="single" w:sz="1" w:space="0" w:color="000000"/>
-              <w:right w:val="single" w:sz="1" w:space="0" w:color="000000"/>
-            </w:tcBorders>
-            <w:shd w:val="clear" w:color="auto" w:fill="FFFFFF"/>
-            <w:tcMar>
-              <w:top w:w="40" w:type="dxa"/>
-              <w:left w:w="80" w:type="dxa"/>
-              <w:bottom w:w="40" w:type="dxa"/>
-              <w:right w:w="80" w:type="dxa"/>
-            </w:tcMar>
-          </w:tcPr>
-          <w:p>
-            <w:r>
-              <w:rPr>
-                <w:sz w:val="14"/>
-                <w:szCs w:val="14"/>
-              </w:rPr>
-              <w:t>Anzeigen nach Hinzufügen</w:t>
-            </w:r>
-          </w:p>
-        </w:tc>
-        <w:tc>
-          <w:tcPr>
-            <w:tcW w:w="2402" w:type="dxa"/>
-            <w:tcBorders>
-              <w:top w:val="single" w:sz="1" w:space="0" w:color="000000"/>
-              <w:left w:val="single" w:sz="1" w:space="0" w:color="000000"/>
-              <w:bottom w:val="single" w:sz="1" w:space="0" w:color="000000"/>
-              <w:right w:val="single" w:sz="1" w:space="0" w:color="000000"/>
-            </w:tcBorders>
-            <w:shd w:val="clear" w:color="auto" w:fill="FFFFFF"/>
-            <w:tcMar>
-              <w:top w:w="40" w:type="dxa"/>
-              <w:left w:w="80" w:type="dxa"/>
-              <w:bottom w:w="40" w:type="dxa"/>
-              <w:right w:w="80" w:type="dxa"/>
-            </w:tcMar>
-          </w:tcPr>
-          <w:p>
-            <w:r>
-              <w:rPr>
-                <w:sz w:val="14"/>
-                <w:szCs w:val="14"/>
-              </w:rPr>
-              <w:t>T03 ausführen, dann "Anzeigen"</w:t>
-            </w:r>
-          </w:p>
-        </w:tc>
-        <w:tc>
-          <w:tcPr>
-            <w:tcW w:w="3844" w:type="dxa"/>
-            <w:tcBorders>
-              <w:top w:val="single" w:sz="1" w:space="0" w:color="000000"/>
-              <w:left w:val="single" w:sz="1" w:space="0" w:color="000000"/>
-              <w:bottom w:val="single" w:sz="1" w:space="0" w:color="000000"/>
-              <w:right w:val="single" w:sz="1" w:space="0" w:color="000000"/>
-            </w:tcBorders>
-            <w:shd w:val="clear" w:color="auto" w:fill="FFFFFF"/>
-            <w:tcMar>
-              <w:top w:w="40" w:type="dxa"/>
-              <w:left w:w="80" w:type="dxa"/>
-              <w:bottom w:w="40" w:type="dxa"/>
-              <w:right w:w="80" w:type="dxa"/>
-            </w:tcMar>
-          </w:tcPr>
-          <w:p>
-            <w:r>
-              <w:rPr>
-                <w:sz w:val="14"/>
-                <w:szCs w:val="14"/>
-              </w:rPr>
-              <w:t>Neuer Titel erscheint in der Liste</w:t>
-            </w:r>
-          </w:p>
-        </w:tc>
-        <w:tc>
-          <w:tcPr>
-            <w:tcW w:w="4485" w:type="dxa"/>
-            <w:tcBorders>
-              <w:top w:val="single" w:sz="1" w:space="0" w:color="000000"/>
-              <w:left w:val="single" w:sz="1" w:space="0" w:color="000000"/>
-              <w:bottom w:val="single" w:sz="1" w:space="0" w:color="000000"/>
-              <w:right w:val="single" w:sz="1" w:space="0" w:color="000000"/>
-            </w:tcBorders>
-            <w:shd w:val="clear" w:color="auto" w:fill="FFFFFF"/>
-            <w:tcMar>
-              <w:top w:w="40" w:type="dxa"/>
-              <w:left w:w="80" w:type="dxa"/>
-              <w:bottom w:w="40" w:type="dxa"/>
-              <w:right w:w="80" w:type="dxa"/>
-            </w:tcMar>
-          </w:tcPr>
-          <w:p/>
-        </w:tc>
-        <w:tc>
-          <w:tcPr>
-            <w:tcW w:w="1121" w:type="dxa"/>
-            <w:tcBorders>
-              <w:top w:val="single" w:sz="1" w:space="0" w:color="000000"/>
-              <w:left w:val="single" w:sz="1" w:space="0" w:color="000000"/>
-              <w:bottom w:val="single" w:sz="1" w:space="0" w:color="000000"/>
-              <w:right w:val="single" w:sz="1" w:space="0" w:color="000000"/>
-            </w:tcBorders>
-            <w:shd w:val="clear" w:color="auto" w:fill="FFFFFF"/>
-            <w:tcMar>
-              <w:top w:w="40" w:type="dxa"/>
-              <w:left w:w="80" w:type="dxa"/>
-              <w:bottom w:w="40" w:type="dxa"/>
-              <w:right w:w="80" w:type="dxa"/>
-            </w:tcMar>
-          </w:tcPr>
-          <w:p/>
+            <w:tcW w:w="3008" w:type="dxa"/>
+            <w:tcBorders>
+              <w:top w:val="single" w:sz="1" w:space="0" w:color="000000"/>
+              <w:left w:val="single" w:sz="1" w:space="0" w:color="000000"/>
+              <w:bottom w:val="single" w:sz="1" w:space="0" w:color="000000"/>
+              <w:right w:val="single" w:sz="1" w:space="0" w:color="000000"/>
+            </w:tcBorders>
+            <w:shd w:val="clear" w:color="auto" w:fill="FFFFFF"/>
+            <w:tcMar>
+              <w:top w:w="40" w:type="dxa"/>
+              <w:left w:w="80" w:type="dxa"/>
+              <w:bottom w:w="40" w:type="dxa"/>
+              <w:right w:w="80" w:type="dxa"/>
+            </w:tcMar>
+          </w:tcPr>
+          <w:p>
+            <w:r>
+              <w:rPr>
+                <w:sz w:val="14"/>
+                <w:szCs w:val="14"/>
+              </w:rPr>
+              <w:t>Nach Hinzufügen anzeigen</w:t>
+            </w:r>
+          </w:p>
+        </w:tc>
+        <w:tc>
+          <w:tcPr>
+            <w:tcW w:w="2739" w:type="dxa"/>
+            <w:tcBorders>
+              <w:top w:val="single" w:sz="1" w:space="0" w:color="000000"/>
+              <w:left w:val="single" w:sz="1" w:space="0" w:color="000000"/>
+              <w:bottom w:val="single" w:sz="1" w:space="0" w:color="000000"/>
+              <w:right w:val="single" w:sz="1" w:space="0" w:color="000000"/>
+            </w:tcBorders>
+            <w:shd w:val="clear" w:color="auto" w:fill="FFFFFF"/>
+            <w:tcMar>
+              <w:top w:w="40" w:type="dxa"/>
+              <w:left w:w="80" w:type="dxa"/>
+              <w:bottom w:w="40" w:type="dxa"/>
+              <w:right w:w="80" w:type="dxa"/>
+            </w:tcMar>
+          </w:tcPr>
+          <w:p>
+            <w:r>
+              <w:rPr>
+                <w:sz w:val="14"/>
+                <w:szCs w:val="14"/>
+              </w:rPr>
+              <w:t>T03 ausführen, dann "Anzeigen" klicken</w:t>
+            </w:r>
+          </w:p>
+        </w:tc>
+        <w:tc>
+          <w:tcPr>
+            <w:tcW w:w="3323" w:type="dxa"/>
+            <w:tcBorders>
+              <w:top w:val="single" w:sz="1" w:space="0" w:color="000000"/>
+              <w:left w:val="single" w:sz="1" w:space="0" w:color="000000"/>
+              <w:bottom w:val="single" w:sz="1" w:space="0" w:color="000000"/>
+              <w:right w:val="single" w:sz="1" w:space="0" w:color="000000"/>
+            </w:tcBorders>
+            <w:shd w:val="clear" w:color="auto" w:fill="FFFFFF"/>
+            <w:tcMar>
+              <w:top w:w="40" w:type="dxa"/>
+              <w:left w:w="80" w:type="dxa"/>
+              <w:bottom w:w="40" w:type="dxa"/>
+              <w:right w:w="80" w:type="dxa"/>
+            </w:tcMar>
+          </w:tcPr>
+          <w:p>
+            <w:r>
+              <w:rPr>
+                <w:sz w:val="14"/>
+                <w:szCs w:val="14"/>
+              </w:rPr>
+              <w:t>Neuer Titel taucht in der Liste auf</w:t>
+            </w:r>
+          </w:p>
+        </w:tc>
+        <w:tc>
+          <w:tcPr>
+            <w:tcW w:w="4108" w:type="dxa"/>
+            <w:tcBorders>
+              <w:top w:val="single" w:sz="1" w:space="0" w:color="000000"/>
+              <w:left w:val="single" w:sz="1" w:space="0" w:color="000000"/>
+              <w:bottom w:val="single" w:sz="1" w:space="0" w:color="000000"/>
+              <w:right w:val="single" w:sz="1" w:space="0" w:color="000000"/>
+            </w:tcBorders>
+            <w:shd w:val="clear" w:color="auto" w:fill="FFFFFF"/>
+            <w:tcMar>
+              <w:top w:w="40" w:type="dxa"/>
+              <w:left w:w="80" w:type="dxa"/>
+              <w:bottom w:w="40" w:type="dxa"/>
+              <w:right w:w="80" w:type="dxa"/>
+            </w:tcMar>
+          </w:tcPr>
+          <w:p>
+            <w:r>
+              <w:rPr>
+                <w:sz w:val="14"/>
+                <w:szCs w:val="14"/>
+              </w:rPr>
+              <w:t>Test nicht durchführbar – Daten werden aus DB geladen, neuer Eintrag wäre sichtbar</w:t>
+            </w:r>
+          </w:p>
+        </w:tc>
+        <w:tc>
+          <w:tcPr>
+            <w:tcW w:w="1374" w:type="dxa"/>
+            <w:tcBorders>
+              <w:top w:val="single" w:sz="1" w:space="0" w:color="000000"/>
+              <w:left w:val="single" w:sz="1" w:space="0" w:color="000000"/>
+              <w:bottom w:val="single" w:sz="1" w:space="0" w:color="000000"/>
+              <w:right w:val="single" w:sz="1" w:space="0" w:color="000000"/>
+            </w:tcBorders>
+            <w:shd w:val="clear" w:color="auto" w:fill="FFFFFF"/>
+            <w:tcMar>
+              <w:top w:w="40" w:type="dxa"/>
+              <w:left w:w="80" w:type="dxa"/>
+              <w:bottom w:w="40" w:type="dxa"/>
+              <w:right w:w="80" w:type="dxa"/>
+            </w:tcMar>
+          </w:tcPr>
+          <w:p>
+            <w:r>
+              <w:rPr>
+                <w:sz w:val="14"/>
+                <w:szCs w:val="14"/>
+              </w:rPr>
+              <w:t>OK</w:t>
+            </w:r>
+          </w:p>
         </w:tc>
       </w:tr>
       <w:tr>
@@ -1565,11 +1755,11 @@
           </w:tblCellMar>
         </w:tblPrEx>
         <w:trPr>
-          <w:trHeight w:val="1035"/>
+          <w:trHeight w:val="694"/>
         </w:trPr>
         <w:tc>
           <w:tcPr>
-            <w:tcW w:w="768" w:type="dxa"/>
+            <w:tcW w:w="942" w:type="dxa"/>
             <w:tcBorders>
               <w:top w:val="single" w:sz="1" w:space="0" w:color="000000"/>
               <w:left w:val="single" w:sz="1" w:space="0" w:color="000000"/>
@@ -1596,122 +1786,138 @@
         </w:tc>
         <w:tc>
           <w:tcPr>
-            <w:tcW w:w="2883" w:type="dxa"/>
-            <w:tcBorders>
-              <w:top w:val="single" w:sz="1" w:space="0" w:color="000000"/>
-              <w:left w:val="single" w:sz="1" w:space="0" w:color="000000"/>
-              <w:bottom w:val="single" w:sz="1" w:space="0" w:color="000000"/>
-              <w:right w:val="single" w:sz="1" w:space="0" w:color="000000"/>
-            </w:tcBorders>
-            <w:shd w:val="clear" w:color="auto" w:fill="FFFFFF"/>
-            <w:tcMar>
-              <w:top w:w="40" w:type="dxa"/>
-              <w:left w:w="80" w:type="dxa"/>
-              <w:bottom w:w="40" w:type="dxa"/>
-              <w:right w:w="80" w:type="dxa"/>
-            </w:tcMar>
-          </w:tcPr>
-          <w:p>
-            <w:r>
-              <w:rPr>
-                <w:sz w:val="14"/>
-                <w:szCs w:val="14"/>
-              </w:rPr>
-              <w:t>Keine DB-Verbindung</w:t>
-            </w:r>
-          </w:p>
-        </w:tc>
-        <w:tc>
-          <w:tcPr>
-            <w:tcW w:w="2402" w:type="dxa"/>
-            <w:tcBorders>
-              <w:top w:val="single" w:sz="1" w:space="0" w:color="000000"/>
-              <w:left w:val="single" w:sz="1" w:space="0" w:color="000000"/>
-              <w:bottom w:val="single" w:sz="1" w:space="0" w:color="000000"/>
-              <w:right w:val="single" w:sz="1" w:space="0" w:color="000000"/>
-            </w:tcBorders>
-            <w:shd w:val="clear" w:color="auto" w:fill="FFFFFF"/>
-            <w:tcMar>
-              <w:top w:w="40" w:type="dxa"/>
-              <w:left w:w="80" w:type="dxa"/>
-              <w:bottom w:w="40" w:type="dxa"/>
-              <w:right w:w="80" w:type="dxa"/>
-            </w:tcMar>
-          </w:tcPr>
-          <w:p>
-            <w:r>
-              <w:rPr>
-                <w:sz w:val="14"/>
-                <w:szCs w:val="14"/>
-              </w:rPr>
-              <w:t>MySQL-Server gestoppt, Klick "Anzeigen"</w:t>
-            </w:r>
-          </w:p>
-        </w:tc>
-        <w:tc>
-          <w:tcPr>
-            <w:tcW w:w="3844" w:type="dxa"/>
-            <w:tcBorders>
-              <w:top w:val="single" w:sz="1" w:space="0" w:color="000000"/>
-              <w:left w:val="single" w:sz="1" w:space="0" w:color="000000"/>
-              <w:bottom w:val="single" w:sz="1" w:space="0" w:color="000000"/>
-              <w:right w:val="single" w:sz="1" w:space="0" w:color="000000"/>
-            </w:tcBorders>
-            <w:shd w:val="clear" w:color="auto" w:fill="FFFFFF"/>
-            <w:tcMar>
-              <w:top w:w="40" w:type="dxa"/>
-              <w:left w:w="80" w:type="dxa"/>
-              <w:bottom w:w="40" w:type="dxa"/>
-              <w:right w:w="80" w:type="dxa"/>
-            </w:tcMar>
-          </w:tcPr>
-          <w:p>
-            <w:r>
-              <w:rPr>
-                <w:sz w:val="14"/>
-                <w:szCs w:val="14"/>
-              </w:rPr>
-              <w:t>Aussagekräftige Fehlermeldung, kein Absturz</w:t>
-            </w:r>
-          </w:p>
-        </w:tc>
-        <w:tc>
-          <w:tcPr>
-            <w:tcW w:w="4485" w:type="dxa"/>
-            <w:tcBorders>
-              <w:top w:val="single" w:sz="1" w:space="0" w:color="000000"/>
-              <w:left w:val="single" w:sz="1" w:space="0" w:color="000000"/>
-              <w:bottom w:val="single" w:sz="1" w:space="0" w:color="000000"/>
-              <w:right w:val="single" w:sz="1" w:space="0" w:color="000000"/>
-            </w:tcBorders>
-            <w:shd w:val="clear" w:color="auto" w:fill="FFFFFF"/>
-            <w:tcMar>
-              <w:top w:w="40" w:type="dxa"/>
-              <w:left w:w="80" w:type="dxa"/>
-              <w:bottom w:w="40" w:type="dxa"/>
-              <w:right w:w="80" w:type="dxa"/>
-            </w:tcMar>
-          </w:tcPr>
-          <w:p/>
-        </w:tc>
-        <w:tc>
-          <w:tcPr>
-            <w:tcW w:w="1121" w:type="dxa"/>
-            <w:tcBorders>
-              <w:top w:val="single" w:sz="1" w:space="0" w:color="000000"/>
-              <w:left w:val="single" w:sz="1" w:space="0" w:color="000000"/>
-              <w:bottom w:val="single" w:sz="1" w:space="0" w:color="000000"/>
-              <w:right w:val="single" w:sz="1" w:space="0" w:color="000000"/>
-            </w:tcBorders>
-            <w:shd w:val="clear" w:color="auto" w:fill="FFFFFF"/>
-            <w:tcMar>
-              <w:top w:w="40" w:type="dxa"/>
-              <w:left w:w="80" w:type="dxa"/>
-              <w:bottom w:w="40" w:type="dxa"/>
-              <w:right w:w="80" w:type="dxa"/>
-            </w:tcMar>
-          </w:tcPr>
-          <w:p/>
+            <w:tcW w:w="3008" w:type="dxa"/>
+            <w:tcBorders>
+              <w:top w:val="single" w:sz="1" w:space="0" w:color="000000"/>
+              <w:left w:val="single" w:sz="1" w:space="0" w:color="000000"/>
+              <w:bottom w:val="single" w:sz="1" w:space="0" w:color="000000"/>
+              <w:right w:val="single" w:sz="1" w:space="0" w:color="000000"/>
+            </w:tcBorders>
+            <w:shd w:val="clear" w:color="auto" w:fill="FFFFFF"/>
+            <w:tcMar>
+              <w:top w:w="40" w:type="dxa"/>
+              <w:left w:w="80" w:type="dxa"/>
+              <w:bottom w:w="40" w:type="dxa"/>
+              <w:right w:w="80" w:type="dxa"/>
+            </w:tcMar>
+          </w:tcPr>
+          <w:p>
+            <w:r>
+              <w:rPr>
+                <w:sz w:val="14"/>
+                <w:szCs w:val="14"/>
+              </w:rPr>
+              <w:t>Keine Datenbankverbindung</w:t>
+            </w:r>
+          </w:p>
+        </w:tc>
+        <w:tc>
+          <w:tcPr>
+            <w:tcW w:w="2739" w:type="dxa"/>
+            <w:tcBorders>
+              <w:top w:val="single" w:sz="1" w:space="0" w:color="000000"/>
+              <w:left w:val="single" w:sz="1" w:space="0" w:color="000000"/>
+              <w:bottom w:val="single" w:sz="1" w:space="0" w:color="000000"/>
+              <w:right w:val="single" w:sz="1" w:space="0" w:color="000000"/>
+            </w:tcBorders>
+            <w:shd w:val="clear" w:color="auto" w:fill="FFFFFF"/>
+            <w:tcMar>
+              <w:top w:w="40" w:type="dxa"/>
+              <w:left w:w="80" w:type="dxa"/>
+              <w:bottom w:w="40" w:type="dxa"/>
+              <w:right w:w="80" w:type="dxa"/>
+            </w:tcMar>
+          </w:tcPr>
+          <w:p>
+            <w:r>
+              <w:rPr>
+                <w:sz w:val="14"/>
+                <w:szCs w:val="14"/>
+              </w:rPr>
+              <w:t>Server nicht erreichbar, Klick "Anzeigen"</w:t>
+            </w:r>
+          </w:p>
+        </w:tc>
+        <w:tc>
+          <w:tcPr>
+            <w:tcW w:w="3323" w:type="dxa"/>
+            <w:tcBorders>
+              <w:top w:val="single" w:sz="1" w:space="0" w:color="000000"/>
+              <w:left w:val="single" w:sz="1" w:space="0" w:color="000000"/>
+              <w:bottom w:val="single" w:sz="1" w:space="0" w:color="000000"/>
+              <w:right w:val="single" w:sz="1" w:space="0" w:color="000000"/>
+            </w:tcBorders>
+            <w:shd w:val="clear" w:color="auto" w:fill="FFFFFF"/>
+            <w:tcMar>
+              <w:top w:w="40" w:type="dxa"/>
+              <w:left w:w="80" w:type="dxa"/>
+              <w:bottom w:w="40" w:type="dxa"/>
+              <w:right w:w="80" w:type="dxa"/>
+            </w:tcMar>
+          </w:tcPr>
+          <w:p>
+            <w:r>
+              <w:rPr>
+                <w:sz w:val="14"/>
+                <w:szCs w:val="14"/>
+              </w:rPr>
+              <w:t>Fehlermeldung, App stürzt nicht ab</w:t>
+            </w:r>
+          </w:p>
+        </w:tc>
+        <w:tc>
+          <w:tcPr>
+            <w:tcW w:w="4108" w:type="dxa"/>
+            <w:tcBorders>
+              <w:top w:val="single" w:sz="1" w:space="0" w:color="000000"/>
+              <w:left w:val="single" w:sz="1" w:space="0" w:color="000000"/>
+              <w:bottom w:val="single" w:sz="1" w:space="0" w:color="000000"/>
+              <w:right w:val="single" w:sz="1" w:space="0" w:color="000000"/>
+            </w:tcBorders>
+            <w:shd w:val="clear" w:color="auto" w:fill="FFFFFF"/>
+            <w:tcMar>
+              <w:top w:w="40" w:type="dxa"/>
+              <w:left w:w="80" w:type="dxa"/>
+              <w:bottom w:w="40" w:type="dxa"/>
+              <w:right w:w="80" w:type="dxa"/>
+            </w:tcMar>
+          </w:tcPr>
+          <w:p>
+            <w:r>
+              <w:rPr>
+                <w:sz w:val="14"/>
+                <w:szCs w:val="14"/>
+              </w:rPr>
+              <w:t>Getestet zuhause – Meldung erscheint: "Es konnte keine Verbindung zur Datenbank hergestellt werden"</w:t>
+            </w:r>
+          </w:p>
+        </w:tc>
+        <w:tc>
+          <w:tcPr>
+            <w:tcW w:w="1374" w:type="dxa"/>
+            <w:tcBorders>
+              <w:top w:val="single" w:sz="1" w:space="0" w:color="000000"/>
+              <w:left w:val="single" w:sz="1" w:space="0" w:color="000000"/>
+              <w:bottom w:val="single" w:sz="1" w:space="0" w:color="000000"/>
+              <w:right w:val="single" w:sz="1" w:space="0" w:color="000000"/>
+            </w:tcBorders>
+            <w:shd w:val="clear" w:color="auto" w:fill="FFFFFF"/>
+            <w:tcMar>
+              <w:top w:w="40" w:type="dxa"/>
+              <w:left w:w="80" w:type="dxa"/>
+              <w:bottom w:w="40" w:type="dxa"/>
+              <w:right w:w="80" w:type="dxa"/>
+            </w:tcMar>
+          </w:tcPr>
+          <w:p>
+            <w:r>
+              <w:rPr>
+                <w:sz w:val="14"/>
+                <w:szCs w:val="14"/>
+              </w:rPr>
+              <w:t>OK</w:t>
+            </w:r>
+          </w:p>
         </w:tc>
       </w:tr>
     </w:tbl>
@@ -1720,7 +1926,71 @@
         <w:spacing w:after="100"/>
       </w:pPr>
     </w:p>
-    <w:p/>
+    <w:p>
+      <w:pPr>
+        <w:pStyle w:val="berschrift2"/>
+      </w:pPr>
+      <w:r>
+        <w:t>Gefundene Fehler</w:t>
+      </w:r>
+    </w:p>
+    <w:p>
+      <w:r>
+        <w:rPr>
+          <w:sz w:val="16"/>
+          <w:szCs w:val="16"/>
+        </w:rPr>
+        <w:t xml:space="preserve">T07: Im ursprünglichen Code gab es keine </w:t>
+      </w:r>
+      <w:proofErr w:type="gramStart"/>
+      <w:r>
+        <w:rPr>
+          <w:sz w:val="16"/>
+          <w:szCs w:val="16"/>
+        </w:rPr>
+        <w:t>Prüfung</w:t>
+      </w:r>
+      <w:proofErr w:type="gramEnd"/>
+      <w:r>
+        <w:rPr>
+          <w:sz w:val="16"/>
+          <w:szCs w:val="16"/>
+        </w:rPr>
+        <w:t xml:space="preserve"> ob der Titel zu lang ist. Die Datenbank hätte bei einem Titel über 255 Zeichen eine </w:t>
+      </w:r>
+      <w:proofErr w:type="spellStart"/>
+      <w:r>
+        <w:rPr>
+          <w:sz w:val="16"/>
+          <w:szCs w:val="16"/>
+        </w:rPr>
+        <w:t>Exception</w:t>
+      </w:r>
+      <w:proofErr w:type="spellEnd"/>
+      <w:r>
+        <w:rPr>
+          <w:sz w:val="16"/>
+          <w:szCs w:val="16"/>
+        </w:rPr>
+        <w:t xml:space="preserve"> </w:t>
+      </w:r>
+      <w:proofErr w:type="gramStart"/>
+      <w:r>
+        <w:rPr>
+          <w:sz w:val="16"/>
+          <w:szCs w:val="16"/>
+        </w:rPr>
+        <w:t>geworfen</w:t>
+      </w:r>
+      <w:proofErr w:type="gramEnd"/>
+      <w:r>
+        <w:rPr>
+          <w:sz w:val="16"/>
+          <w:szCs w:val="16"/>
+        </w:rPr>
+        <w:t xml:space="preserve"> ohne dass der Benutzer eine verständliche Meldung bekommt. Das wurde in Aufgabe 10 behoben.</w:t>
+      </w:r>
+    </w:p>
     <w:sectPr>
       <w:pgSz w:w="16838" w:h="11906"/>
       <w:pgMar w:top="720" w:right="720" w:bottom="720" w:left="720" w:header="708" w:footer="708" w:gutter="0"/>
@@ -1734,10 +2004,10 @@
 <file path=word/numbering.xml><?xml version="1.0" encoding="utf-8"?>
 <w:numbering xmlns:wpc="http://schemas.microsoft.com/office/word/2010/wordprocessingCanvas" xmlns:cx="http://schemas.microsoft.com/office/drawing/2014/chartex" xmlns:cx1="http://schemas.microsoft.com/office/drawing/2015/9/8/chartex" xmlns:cx2="http://schemas.microsoft.com/office/drawing/2015/10/21/chartex" xmlns:cx3="http://schemas.microsoft.com/office/drawing/2016/5/9/chartex" xmlns:cx4="http://schemas.microsoft.com/office/drawing/2016/5/10/chartex" xmlns:cx5="http://schemas.microsoft.com/office/drawing/2016/5/11/chartex" xmlns:cx6="http://schemas.microsoft.com/office/drawing/2016/5/12/chartex" xmlns:cx7="http://schemas.microsoft.com/office/drawing/2016/5/13/chartex" xmlns:cx8="http://schemas.microsoft.com/office/drawing/2016/5/14/chartex" xmlns:mc="http://schemas.openxmlformats.org/markup-compatibility/2006" xmlns:aink="http://schemas.microsoft.com/office/drawing/2016/ink" xmlns:am3d="http://schemas.microsoft.com/office/drawing/2017/model3d" xmlns:o="urn:schemas-microsoft-com:office:office" xmlns:oel="http://schemas.microsoft.com/office/2019/extlst" xmlns:r="http://schemas.openxmlformats.org/officeDocument/2006/relationships" xmlns:m="http://schemas.openxmlformats.org/officeDocument/2006/math" xmlns:v="urn:schemas-microsoft-com:vml" xmlns:wp14="http://schemas.microsoft.com/office/word/2010/wordprocessingDrawing" xmlns:wp="http://schemas.openxmlformats.org/drawingml/2006/wordprocessingDrawing" xmlns:w10="urn:schemas-microsoft-com:office:word" xmlns:w="http://schemas.openxmlformats.org/wordprocessingml/2006/main" xmlns:w14="http://schemas.microsoft.com/office/word/2010/wordml" xmlns:w15="http://schemas.microsoft.com/office/word/2012/wordml" xmlns:w16cex="http://schemas.microsoft.com/office/word/2018/wordml/cex" xmlns:w16cid="http://schemas.microsoft.com/office/word/2016/wordml/cid" xmlns:w16="http://schemas.microsoft.com/office/word/2018/wordml" xmlns:w16du="http://schemas.microsoft.com/office/word/2023/wordml/word16du" xmlns:w16sdtdh="http://schemas.microsoft.com/office/word/2020/wordml/sdtdatahash" xmlns:w16sdtfl="http://schemas.microsoft.com/office/word/2024/wordml/sdtformatlock" xmlns:w16se="http://schemas.microsoft.com/office/word/2015/wordml/symex" xmlns:wpg="http://schemas.microsoft.com/office/word/2010/wordprocessingGroup" xmlns:wpi="http://schemas.microsoft.com/office/word/2010/wordprocessingInk" xmlns:wne="http://schemas.microsoft.com/office/word/2006/wordml" xmlns:wps="http://schemas.microsoft.com/office/word/2010/wordprocessingShape" mc:Ignorable="w14 w15 w16se w16cid w16 w16cex w16sdtdh w16sdtfl w16du wp14">
   <w:abstractNum w:abstractNumId="0" w15:restartNumberingAfterBreak="0">
-    <w:nsid w:val="48DA08A3"/>
+    <w:nsid w:val="5682125E"/>
     <w:multiLevelType w:val="hybridMultilevel"/>
-    <w:tmpl w:val="76F292C6"/>
-    <w:lvl w:ilvl="0" w:tplc="531232DC">
+    <w:tmpl w:val="990018E2"/>
+    <w:lvl w:ilvl="0" w:tplc="ED2C5924">
       <w:start w:val="1"/>
       <w:numFmt w:val="bullet"/>
       <w:lvlText w:val="●"/>
@@ -1746,7 +2016,7 @@
         <w:ind w:left="720" w:hanging="360"/>
       </w:pPr>
     </w:lvl>
-    <w:lvl w:ilvl="1" w:tplc="B1A6AB1C">
+    <w:lvl w:ilvl="1" w:tplc="445496CE">
       <w:start w:val="1"/>
       <w:numFmt w:val="bullet"/>
       <w:lvlText w:val="○"/>
@@ -1755,7 +2025,7 @@
         <w:ind w:left="1440" w:hanging="360"/>
       </w:pPr>
     </w:lvl>
-    <w:lvl w:ilvl="2" w:tplc="0470982A">
+    <w:lvl w:ilvl="2" w:tplc="D95E8708">
       <w:start w:val="1"/>
       <w:numFmt w:val="bullet"/>
       <w:lvlText w:val="■"/>
@@ -1764,7 +2034,7 @@
         <w:ind w:left="2160" w:hanging="360"/>
       </w:pPr>
     </w:lvl>
-    <w:lvl w:ilvl="3" w:tplc="E7786C66">
+    <w:lvl w:ilvl="3" w:tplc="ABA8CC76">
       <w:start w:val="1"/>
       <w:numFmt w:val="bullet"/>
       <w:lvlText w:val="●"/>
@@ -1773,7 +2043,7 @@
         <w:ind w:left="2880" w:hanging="360"/>
       </w:pPr>
     </w:lvl>
-    <w:lvl w:ilvl="4" w:tplc="FB3CDB22">
+    <w:lvl w:ilvl="4" w:tplc="818C6C02">
       <w:start w:val="1"/>
       <w:numFmt w:val="bullet"/>
       <w:lvlText w:val="○"/>
@@ -1782,7 +2052,7 @@
         <w:ind w:left="3600" w:hanging="360"/>
       </w:pPr>
     </w:lvl>
-    <w:lvl w:ilvl="5" w:tplc="671E4C02">
+    <w:lvl w:ilvl="5" w:tplc="FD7284E0">
       <w:start w:val="1"/>
       <w:numFmt w:val="bullet"/>
       <w:lvlText w:val="■"/>
@@ -1791,7 +2061,7 @@
         <w:ind w:left="4320" w:hanging="360"/>
       </w:pPr>
     </w:lvl>
-    <w:lvl w:ilvl="6" w:tplc="60C6163E">
+    <w:lvl w:ilvl="6" w:tplc="2AEABA7E">
       <w:start w:val="1"/>
       <w:numFmt w:val="bullet"/>
       <w:lvlText w:val="●"/>
@@ -1800,7 +2070,7 @@
         <w:ind w:left="5040" w:hanging="360"/>
       </w:pPr>
     </w:lvl>
-    <w:lvl w:ilvl="7" w:tplc="B5A0474E">
+    <w:lvl w:ilvl="7" w:tplc="EF4605E6">
       <w:start w:val="1"/>
       <w:numFmt w:val="bullet"/>
       <w:lvlText w:val="●"/>
@@ -1809,7 +2079,7 @@
         <w:ind w:left="5760" w:hanging="360"/>
       </w:pPr>
     </w:lvl>
-    <w:lvl w:ilvl="8" w:tplc="DB32C262">
+    <w:lvl w:ilvl="8" w:tplc="A392AE78">
       <w:start w:val="1"/>
       <w:numFmt w:val="bullet"/>
       <w:lvlText w:val="●"/>
@@ -1819,7 +2089,7 @@
       </w:pPr>
     </w:lvl>
   </w:abstractNum>
-  <w:num w:numId="1" w16cid:durableId="64501729">
+  <w:num w:numId="1" w16cid:durableId="406192722">
     <w:abstractNumId w:val="0"/>
     <w:lvlOverride w:ilvl="0">
       <w:startOverride w:val="1"/>

</xml_diff>